<commit_message>
Separate target evaluation from fixed-scene weather navigation
</commit_message>
<xml_diff>
--- a/outputs/reports/Midterm_Project_Report.docx
+++ b/outputs/reports/Midterm_Project_Report.docx
@@ -66,7 +66,7 @@
         <w:jc w:val="center"/>
       </w:pPr>
       <w:r>
-        <w:t>October 18 2026</w:t>
+        <w:t>October 19 2026</w:t>
       </w:r>
     </w:p>
     <w:p>
@@ -80,7 +80,7 @@
     </w:p>
     <w:p>
       <w:r>
-        <w:t>This project models a spinning three dimensional pulsed LiDAR with opaque visibility, surface response, attenuation, and receiver noise. A cluttered navigation task supplies 22 controlled settings, 66 closed-loop runs, and 66 replays at identical baseline poses. A direct 3D diagram separates field of view from occlusion. An independent 33,000-trial experiment probes detection near the receiver threshold at three navigation viewpoints; its probability calibration RMS error is 0.55 percentage points. A further 720 runs compare 12 sensor conditions across three fixed layouts and 20 noise seeds. Run-level confidence intervals, collision and timeout counts, and failure-aware clearance distributions expose task limits. Measured maps show why successful navigation does not imply complete perception. These experiments verify the virtual model and its dependencies within stated assumptions; physical calibration remains future work.</w:t>
+        <w:t>This project models a spinning three dimensional pulsed LiDAR with opaque visibility, surface response, attenuation, and receiver noise. Evaluation has two parts: nine target-characteristic settings at matched robot poses, and clear air, rain, and fog navigation in one fixed obstacle setup. Nine recorded weather runs retain all trajectories and measurement profiles. Attenuation reduces mean observed endpoint cells from 73.7 to 47.1 percent while all nine runs reach the goal. An independent 33,000-trial experiment checks detection near threshold; probability calibration RMS error is 0.55 percentage points. These results establish internal model consistency and conditional environmental dependencies. Three navigation seeds are descriptive; physical calibration and general reliability remain untested.</w:t>
       </w:r>
     </w:p>
     <w:p>
@@ -98,7 +98,7 @@
     </w:p>
     <w:p>
       <w:r>
-        <w:t>The sensor uses eight channels for the navigation studies. Physical surface modeling is motivated by Heiden et al. [2], whose continuous wave phase estimator differs from this pulsed geometric approximation. Controlled replays isolate measurement effects, threshold trials resolve uncertain detections, and repeated navigation tests measure consequences. Target geometry interventions are interpreted together with their visibility changes.</w:t>
+        <w:t>The navigation sensor uses eight channels. Surface modeling is motivated by Heiden et al. [2], whose continuous wave phase estimator differs from this pulsed geometric approximation. Target experiments quantify geometric exposure and surface response; weather experiments hold the physical scene, robot, sensor, reference route, and controller fixed. Threshold trials resolve uncertain detections independently of navigation.</w:t>
       </w:r>
     </w:p>
     <w:p>
@@ -2407,17 +2407,17 @@
     </w:p>
     <w:p>
       <w:r>
-        <w:t>Python and NumPy generate measurements; independent renderers read saved results. The primary cluttered task has 12 objects: nine in the planning map and three unknown to the planner. Its designated target is a pure diffuse box centered at (11, 1.1, 0.6) m, sized (0.8, 1.6, 1.2) m, with diffuse weight 0.30.</w:t>
+        <w:t>Python and NumPy generate measurements; independent renderers read saved results. The fixed navigation scene has 12 objects: nine in the planning map and three unknown to the planner. Its designated target is a pure diffuse box centered at (11, 1.1, 0.6) m, sized (0.8, 1.6, 1.2) m, with diffuse weight 0.30.</w:t>
       </w:r>
     </w:p>
     <w:p>
       <w:r>
-        <w:t>The baseline uses eight channels from -20 to +10 degrees, 360 azimuths, one subray, a level 0.6 m mount, and 0.5-200 m range gates. Parameters are 75 W peak power, 25 mm aperture, 0.5 efficiency, 4 × 10⁻⁹ W power noise RMS, threshold factor 10, 0.01 m range floor, 5 ns pulse, and 1 ns rise time.</w:t>
+        <w:t>The sensor uses eight channels from -20 to +10 degrees, 360 azimuths, one subray, a level 0.6 m mount, and 0.5-200 m gates. Parameters are 75 W peak power, 25 mm aperture, 0.5 efficiency, 4 × 10⁻⁹ W power noise RMS, threshold factor 10, 0.01 m range floor, 5 ns pulse, and 1 ns rise time.</w:t>
       </w:r>
     </w:p>
     <w:p>
       <w:r>
-        <w:t>A* supplies a reference from (0, 0) to (18, 0) m on a 0.25 m grid, with 0.90 m total inflation and checked shortcuts. The measured-point controller uses 0.12 ≤ z ≤ 1 m, without target labels or true obstacle geometry. Limits are 1.2 m/s, 90 degrees/s, 0.2 s steps, and 36 s duration. Forward Euler integrates</w:t>
+        <w:t>A* supplies a shared reference from (0, 0) to (18, 0) m on a 0.25 m grid, with 0.90 m total inflation. The measured-point controller uses 0.12 ≤ z ≤ 1 m without object labels. Limits are 1.2 m/s, 90 degrees/s, 0.2 s steps, and 36 s. Forward Euler integrates</w:t>
       </w:r>
     </w:p>
     <w:p>
@@ -2660,12 +2660,12 @@
         <w:pStyle w:val="Heading2"/>
       </w:pPr>
       <w:r>
-        <w:t>3.1 Controlled dependencies</w:t>
+        <w:t>3.1 Target characteristics</w:t>
       </w:r>
     </w:p>
     <w:p>
       <w:r>
-        <w:t>Vary pose, FOV, LOS, target geometry and reflectance, attenuation, noise, sampling, and enabled sensing in 22 settings. Each has three closed-loop runs and three replays at 271 common baseline snapshots (seeds 1-3). Count emitted target intersections, nearest visible hits, in-gate eligible echoes NE, and detections ND separately. For qi from Equation (9),</w:t>
+        <w:t>Nine target settings vary diffuse weight (0.02, 0.30, 0.85), yaw (0, 45, 75 degrees), height (0.3, 1.2, 2.0 m), and center x (9, 11, 13 m). Each is replayed at the same 271 baseline snapshots across three seeds. The shared baseline appears in both evaluation parts. Count target intersections, nearest visible hits, in-gate eligible echoes NE, and detections ND separately. For qi from Equation (9),</w:t>
       </w:r>
     </w:p>
     <w:p>
@@ -2842,12 +2842,12 @@
         <w:pStyle w:val="Heading2"/>
       </w:pPr>
       <w:r>
-        <w:t>3.2 Threshold and robustness studies</w:t>
+        <w:t>3.2 Environmental conditions through navigation</w:t>
       </w:r>
     </w:p>
     <w:p>
       <w:r>
-        <w:t>At three saved approach poses, extract one eligible target ray at ranges 7.99, 4.90, and 1.93 m. Fix each ray and solve extinction to obtain mean SNR 6-14 at 11 settings. Draw 1,000 actual scans per setting using 33,000 disjoint noise seeds, independent of navigation. Keep all misses in the denominator. These coefficients are illustrative optical stress, not calibrated weather.</w:t>
+        <w:t>Hold all obstacle geometry, target properties, sensor settings, robot parameters, controller, and reference route fixed. Compare clear air (κ = 0.0002 m⁻¹), rain at 50 mm/h (effective κ = 0.104764 m⁻¹), and fog represented by κ = 0.6 m⁻¹. Each condition uses seeds 1-3: nine closed-loop runs and nine matched-pose replays, including the shared baseline. All recorded trajectories and metric histories are retained.</w:t>
       </w:r>
     </w:p>
     <w:p>
@@ -2855,7 +2855,7 @@
         <w:spacing w:after="0"/>
       </w:pPr>
       <w:r>
-        <w:t>Freeze 12 conditions on the original three environment presets, including barrels, distinct from the primary box-target scene. Run 20 seeds (1001-1020) per cell: 720 runs. Reuse each layout’s partial-map reference and controller. Test extinction 0.0002, 0.1, 0.3, 0.6, 1.2, 3, and 10 m⁻¹, high mount, sparse sampling, front and side FOV, and disabled sensing. Retain every failure; one whole run is the statistical unit. Paired seeds do not imply identical per-ray noise.</w:t>
+        <w:t>Points per scan include all detected surfaces. Mapping reports endpoint-observed cells, not free space or accuracy. Target range RMS pools squared errors over detected replay returns; misses are not zero errors. Weather coefficients are illustrative attenuation settings; no backscatter or false weather returns are modeled. Three navigation seeds provide descriptive comparisons, not a reliability estimate.</w:t>
       </w:r>
     </w:p>
     <w:p>
@@ -2872,7 +2872,7 @@
         <w:pStyle w:val="Heading2"/>
       </w:pPr>
       <w:r>
-        <w:t>4.1 Sensor pose and visibility</w:t>
+        <w:t>4.1 Target characteristics</w:t>
       </w:r>
     </w:p>
     <w:p>
@@ -2884,8 +2884,8 @@
       <w:r>
         <w:drawing>
           <wp:inline xmlns:a="http://schemas.openxmlformats.org/drawingml/2006/main" xmlns:pic="http://schemas.openxmlformats.org/drawingml/2006/picture">
-            <wp:extent cx="5943600" cy="2560320"/>
-            <wp:docPr id="1" name="Picture 1" descr="Same-pose three dimensional FOV diagram with visible target rays and opaque-panel blocked ray continuations."/>
+            <wp:extent cx="4655820" cy="2148840"/>
+            <wp:docPr id="1" name="Picture 1" descr="Full-circle field of view and natural target occlusion by an existing wall in the unchanged weather scene."/>
             <wp:cNvGraphicFramePr>
               <a:graphicFrameLocks noChangeAspect="1"/>
             </wp:cNvGraphicFramePr>
@@ -2893,7 +2893,7 @@
               <a:graphicData uri="http://schemas.openxmlformats.org/drawingml/2006/picture">
                 <pic:pic>
                   <pic:nvPicPr>
-                    <pic:cNvPr id="0" name="report_fov_los_3d.png"/>
+                    <pic:cNvPr id="0" name="weather_fov_los.png"/>
                     <pic:cNvPicPr/>
                   </pic:nvPicPr>
                   <pic:blipFill>
@@ -2905,7 +2905,7 @@
                   <pic:spPr>
                     <a:xfrm>
                       <a:off x="0" y="0"/>
-                      <a:ext cx="5943600" cy="2560320"/>
+                      <a:ext cx="4655820" cy="2148840"/>
                     </a:xfrm>
                     <a:prstGeom prst="rect"/>
                   </pic:spPr>
@@ -2921,39 +2921,7 @@
         <w:pStyle w:val="Caption"/>
       </w:pPr>
       <w:r>
-        <w:t>Figure 1  Same-pose 3D coverage and occlusion at 8.2 s. Blue rays reach the target; solid red rays stop at the panel; dashed red segments show blocked continuations. Scene geometry explains visibility; it is not a measured cloud.</w:t>
-      </w:r>
-    </w:p>
-    <w:p>
-      <w:r>
-        <w:t>The angular FOV is ±60 degrees horizontally and -20 to +10 vertically. Display ends at 4 m; physical gates are 0.5-200 m, with the near cutout omitted. Each panel emits 968 beams, including 311 target intersections. The panel changes 311 visible target hits into 188 visible and 123 blocked. All rays are audited; representative rays are drawn. The envelope contains channel gaps.</w:t>
-      </w:r>
-    </w:p>
-    <w:p>
-      <w:r>
-        <w:t>Height changes the intersections predicted by Equation (12). In the primary replays, raising the mount from 0.6 to 1.6 m reduces eligible target echoes from 46,712 to 21,621 and worst navigation gap from 0.330 to 0.096 m. Pitch offsets also move the sampled surfaces; positive pitch points downward.</w:t>
-      </w:r>
-    </w:p>
-    <w:p>
-      <w:r>
-        <w:t>Post-hoc geometry at the open high-mount run’s last four poses (seed 1001) shows 152-173 visible barrel rays per pose, none in the controller’s height band. Restoring a 0.6 m mount at identical XY/yaw gives 286-544 in-band intersections. Visible 3D surfaces can therefore miss body-relevant coverage. High mounting causes 20/20 collisions in open and narrow layouts; cluttered 19/20 goals accompany a median gap of only 1.8 mm.</w:t>
-      </w:r>
-    </w:p>
-    <w:p>
-      <w:pPr>
-        <w:spacing w:after="0"/>
-      </w:pPr>
-      <w:r>
-        <w:t>Full-circle yaw of 60 degrees preserves geometry by permuting the grid. Primary replays retain 14,421 target opportunities with front 120-degree FOV; sideways coverage has none and causes three collisions. Its conditional detection probability is undefined. The LOS panel also changes physical obstacle geometry.</w:t>
-      </w:r>
-    </w:p>
-    <w:p>
-      <w:pPr>
-        <w:pStyle w:val="Heading2"/>
-        <w:pageBreakBefore/>
-      </w:pPr>
-      <w:r>
-        <w:t>4.2 Target and environmental dependencies</w:t>
+        <w:t>Figure 1  Unchanged baseline at 2.6 s: 2,880 emitted rays; 12 visible and 12 existing-wall-blocked target rays. Only representative rays and relevant true surfaces are drawn. The full-circle angular envelope is clipped at 4 m; target rays extend farther. This is explanatory geometry, not measured map points.</w:t>
       </w:r>
     </w:p>
     <w:p>
@@ -2965,8 +2933,8 @@
       <w:r>
         <w:drawing>
           <wp:inline xmlns:a="http://schemas.openxmlformats.org/drawingml/2006/main" xmlns:pic="http://schemas.openxmlformats.org/drawingml/2006/picture">
-            <wp:extent cx="5943600" cy="2743200"/>
-            <wp:docPr id="2" name="Picture 2" descr="Target and atmospheric power ratios, measured detection counts, and measured versus predicted target range RMS."/>
+            <wp:extent cx="5664993" cy="2788920"/>
+            <wp:docPr id="2" name="Picture 2" descr="Nine matched-pose target-characteristic settings with eligible optical power, geometric sampling, detected-return range RMS and target features."/>
             <wp:cNvGraphicFramePr>
               <a:graphicFrameLocks noChangeAspect="1"/>
             </wp:cNvGraphicFramePr>
@@ -2974,7 +2942,7 @@
               <a:graphicData uri="http://schemas.openxmlformats.org/drawingml/2006/picture">
                 <pic:pic>
                   <pic:nvPicPr>
-                    <pic:cNvPr id="0" name="report_physical_dependencies.png"/>
+                    <pic:cNvPr id="0" name="target_characteristics.png"/>
                     <pic:cNvPicPr/>
                   </pic:nvPicPr>
                   <pic:blipFill>
@@ -2986,7 +2954,7 @@
                   <pic:spPr>
                     <a:xfrm>
                       <a:off x="0" y="0"/>
-                      <a:ext cx="5943600" cy="2743200"/>
+                      <a:ext cx="5664993" cy="2788920"/>
                     </a:xfrm>
                     <a:prstGeom prst="rect"/>
                   </pic:spPr>
@@ -3002,27 +2970,7 @@
         <w:pStyle w:val="Caption"/>
       </w:pPr>
       <w:r>
-        <w:t>Figure 2  Fixed-pose replay comparisons. Power ratios use independently evaluated noiseless eligible-beam predictions; counts and range errors use measured returns. Moved, rotated, and resized targets change geometric exposure. Range RMS is conditional on detected target returns.</w:t>
-      </w:r>
-    </w:p>
-    <w:p>
-      <w:r>
-        <w:t>Diffuse weights 0.02, 0.30, and 0.85 give power ratios 0.0667, 1, and 2.8333, following Equation (7). All eligible target echoes remain detected and paths remain unchanged: a physical power change need not alter a strongly illuminated target’s detection or the task.</w:t>
-      </w:r>
-    </w:p>
-    <w:p>
-      <w:r>
-        <w:t>Target heights of 0.3, 1.2, and 2.0 m give 17,851, 47,562, and 50,191 intersections. This exposes discrete angular sampling of target size. Target yaw 45 and 75 degrees changes mean eligible incidence to 36.16 and 34.74 degrees. Rotation also changes projected area and footprint, so these cases demonstrate combined geometry and surface response, rather than a pure cosine-only intervention.</w:t>
-      </w:r>
-    </w:p>
-    <w:p>
-      <w:r>
-        <w:t>Target position is compared at one common viewpoint. At seed-1 time 6 s, moving the target center to x = 9, 11, and 13 m gives mean eligible ranges 2.134, 4.011, and 5.950 m and powers 0.339830, 0.105144, and 0.048696 mW. The decrease is consistent with range and incidence in Equation (7). Pooled whole-route power can reverse this ordering because the target exposures and range gates differ.</w:t>
-      </w:r>
-    </w:p>
-    <w:p>
-      <w:r>
-        <w:t>Rain at 50 mm/h and extinction 0.6 m⁻¹ reduce mean eligible power from 0.745081 to 0.575356 and 0.187126 mW, consistent with Equation (13). Four-degree azimuth spacing reduces eligible target echoes from 46,712 to 11,592. Sampling removes opportunities; attenuation weakens echoes.</w:t>
+        <w:t>Figure 2  All nine target settings at matched baseline poses. Power is the noiseless eligible-echo mean; counts distinguish intersections, eligibility, and detections. Range RMS is conditional on detected target returns. Target position, orientation, and size also change geometric exposure.</w:t>
       </w:r>
     </w:p>
     <w:p>
@@ -3030,7 +2978,531 @@
         <w:spacing w:after="0"/>
       </w:pPr>
       <w:r>
-        <w:t>Tenfold receiver noise changes detected-target range RMS from 9.992 to 10.082 mm, versus predictions 10.010 and 10.095 mm. The 10 mm floor dominates these strong echoes; the threshold study below probes weaker signals.</w:t>
+        <w:t>Diffuse weights 0.02, 0.30, and 0.85 give power ratios 0.0667, 1, and 2.8333. At one common seed-1 viewpoint (6 s), target centers x = 9, 11, and 13 m give ranges 2.134, 4.011, and 5.950 m and powers 0.339830, 0.105144, and 0.048696 mW. Whole-route averages need not preserve this ordering because eligible exposures and incidence differ.</w:t>
+      </w:r>
+    </w:p>
+    <w:p>
+      <w:pPr>
+        <w:pStyle w:val="Heading2"/>
+        <w:pageBreakBefore/>
+      </w:pPr>
+      <w:r>
+        <w:t>4.2 Environmental measurement metrics</w:t>
+      </w:r>
+    </w:p>
+    <w:p>
+      <w:pPr>
+        <w:pStyle w:val="Caption"/>
+      </w:pPr>
+      <w:r>
+        <w:t>Table 1  Same fixed scene; three seeds per weather condition. Navigation/map values are means of run summaries. Range RMS and detection fraction pool target echoes at identical baseline poses.</w:t>
+      </w:r>
+    </w:p>
+    <w:tbl>
+      <w:tblPr>
+        <w:tblW w:type="auto" w:w="0"/>
+        <w:jc w:val="center"/>
+        <w:tblLayout w:type="fixed"/>
+        <w:tblLook w:firstColumn="1" w:firstRow="1" w:lastColumn="0" w:lastRow="0" w:noHBand="0" w:noVBand="1" w:val="04A0"/>
+        <w:tblBorders>
+          <w:top w:val="single" w:sz="4" w:color="D9D9D9"/>
+          <w:left w:val="single" w:sz="4" w:color="D9D9D9"/>
+          <w:bottom w:val="single" w:sz="4" w:color="D9D9D9"/>
+          <w:right w:val="single" w:sz="4" w:color="D9D9D9"/>
+          <w:insideH w:val="single" w:sz="4" w:color="D9D9D9"/>
+          <w:insideV w:val="single" w:sz="4" w:color="D9D9D9"/>
+        </w:tblBorders>
+        <w:tblCellMar>
+          <w:top w:w="65" w:type="dxa"/>
+          <w:left w:w="90" w:type="dxa"/>
+          <w:bottom w:w="65" w:type="dxa"/>
+          <w:right w:w="90" w:type="dxa"/>
+        </w:tblCellMar>
+      </w:tblPr>
+      <w:tblGrid>
+        <w:gridCol w:w="2160"/>
+        <w:gridCol w:w="1728"/>
+        <w:gridCol w:w="1728"/>
+        <w:gridCol w:w="1656"/>
+        <w:gridCol w:w="2088"/>
+      </w:tblGrid>
+      <w:tr>
+        <w:trPr>
+          <w:cantSplit/>
+          <w:tblHeader/>
+        </w:trPr>
+        <w:tc>
+          <w:tcPr>
+            <w:tcW w:type="dxa" w:w="2160"/>
+            <w:vAlign w:val="center"/>
+            <w:shd w:fill="EEEEEE"/>
+          </w:tcPr>
+          <w:p>
+            <w:pPr>
+              <w:spacing w:line="240" w:lineRule="auto" w:after="0"/>
+              <w:jc w:val="left"/>
+            </w:pPr>
+            <w:r>
+              <w:rPr>
+                <w:b/>
+                <w:sz w:val="22"/>
+              </w:rPr>
+              <w:t>Condition</w:t>
+            </w:r>
+          </w:p>
+        </w:tc>
+        <w:tc>
+          <w:tcPr>
+            <w:tcW w:type="dxa" w:w="1728"/>
+            <w:vAlign w:val="center"/>
+            <w:shd w:fill="EEEEEE"/>
+          </w:tcPr>
+          <w:p>
+            <w:pPr>
+              <w:spacing w:line="240" w:lineRule="auto" w:after="0"/>
+              <w:jc w:val="center"/>
+            </w:pPr>
+            <w:r>
+              <w:rPr>
+                <w:b/>
+                <w:sz w:val="22"/>
+              </w:rPr>
+              <w:t>Mean points / scan</w:t>
+            </w:r>
+          </w:p>
+        </w:tc>
+        <w:tc>
+          <w:tcPr>
+            <w:tcW w:type="dxa" w:w="1728"/>
+            <w:vAlign w:val="center"/>
+            <w:shd w:fill="EEEEEE"/>
+          </w:tcPr>
+          <w:p>
+            <w:pPr>
+              <w:spacing w:line="240" w:lineRule="auto" w:after="0"/>
+              <w:jc w:val="center"/>
+            </w:pPr>
+            <w:r>
+              <w:rPr>
+                <w:b/>
+                <w:sz w:val="22"/>
+              </w:rPr>
+              <w:t>Observed cells (%)</w:t>
+            </w:r>
+          </w:p>
+        </w:tc>
+        <w:tc>
+          <w:tcPr>
+            <w:tcW w:type="dxa" w:w="1656"/>
+            <w:vAlign w:val="center"/>
+            <w:shd w:fill="EEEEEE"/>
+          </w:tcPr>
+          <w:p>
+            <w:pPr>
+              <w:spacing w:line="240" w:lineRule="auto" w:after="0"/>
+              <w:jc w:val="center"/>
+            </w:pPr>
+            <w:r>
+              <w:rPr>
+                <w:b/>
+                <w:sz w:val="22"/>
+              </w:rPr>
+              <w:t>Target RMS (mm)</w:t>
+            </w:r>
+          </w:p>
+        </w:tc>
+        <w:tc>
+          <w:tcPr>
+            <w:tcW w:type="dxa" w:w="2088"/>
+            <w:vAlign w:val="center"/>
+            <w:shd w:fill="EEEEEE"/>
+          </w:tcPr>
+          <w:p>
+            <w:pPr>
+              <w:spacing w:line="240" w:lineRule="auto" w:after="0"/>
+              <w:jc w:val="center"/>
+            </w:pPr>
+            <w:r>
+              <w:rPr>
+                <w:b/>
+                <w:sz w:val="22"/>
+              </w:rPr>
+              <w:t>Detected / eligible (%)</w:t>
+            </w:r>
+          </w:p>
+        </w:tc>
+      </w:tr>
+      <w:tr>
+        <w:trPr>
+          <w:cantSplit/>
+        </w:trPr>
+        <w:tc>
+          <w:tcPr>
+            <w:tcW w:type="dxa" w:w="2160"/>
+            <w:vAlign w:val="center"/>
+          </w:tcPr>
+          <w:p>
+            <w:pPr>
+              <w:spacing w:line="240" w:lineRule="auto" w:after="0"/>
+              <w:jc w:val="left"/>
+            </w:pPr>
+            <w:r>
+              <w:rPr>
+                <w:b w:val="0"/>
+                <w:sz w:val="22"/>
+              </w:rPr>
+              <w:t>Clear</w:t>
+            </w:r>
+          </w:p>
+        </w:tc>
+        <w:tc>
+          <w:tcPr>
+            <w:tcW w:type="dxa" w:w="1728"/>
+            <w:vAlign w:val="center"/>
+          </w:tcPr>
+          <w:p>
+            <w:pPr>
+              <w:spacing w:line="240" w:lineRule="auto" w:after="0"/>
+              <w:jc w:val="center"/>
+            </w:pPr>
+            <w:r>
+              <w:rPr>
+                <w:b w:val="0"/>
+                <w:sz w:val="22"/>
+              </w:rPr>
+              <w:t>2,198.4</w:t>
+            </w:r>
+          </w:p>
+        </w:tc>
+        <w:tc>
+          <w:tcPr>
+            <w:tcW w:type="dxa" w:w="1728"/>
+            <w:vAlign w:val="center"/>
+          </w:tcPr>
+          <w:p>
+            <w:pPr>
+              <w:spacing w:line="240" w:lineRule="auto" w:after="0"/>
+              <w:jc w:val="center"/>
+            </w:pPr>
+            <w:r>
+              <w:rPr>
+                <w:b w:val="0"/>
+                <w:sz w:val="22"/>
+              </w:rPr>
+              <w:t>73.67</w:t>
+            </w:r>
+          </w:p>
+        </w:tc>
+        <w:tc>
+          <w:tcPr>
+            <w:tcW w:type="dxa" w:w="1656"/>
+            <w:vAlign w:val="center"/>
+          </w:tcPr>
+          <w:p>
+            <w:pPr>
+              <w:spacing w:line="240" w:lineRule="auto" w:after="0"/>
+              <w:jc w:val="center"/>
+            </w:pPr>
+            <w:r>
+              <w:rPr>
+                <w:b w:val="0"/>
+                <w:sz w:val="22"/>
+              </w:rPr>
+              <w:t>9.992</w:t>
+            </w:r>
+          </w:p>
+        </w:tc>
+        <w:tc>
+          <w:tcPr>
+            <w:tcW w:type="dxa" w:w="2088"/>
+            <w:vAlign w:val="center"/>
+          </w:tcPr>
+          <w:p>
+            <w:pPr>
+              <w:spacing w:line="240" w:lineRule="auto" w:after="0"/>
+              <w:jc w:val="center"/>
+            </w:pPr>
+            <w:r>
+              <w:rPr>
+                <w:b w:val="0"/>
+                <w:sz w:val="22"/>
+              </w:rPr>
+              <w:t>100.00</w:t>
+            </w:r>
+          </w:p>
+        </w:tc>
+      </w:tr>
+      <w:tr>
+        <w:trPr>
+          <w:cantSplit/>
+        </w:trPr>
+        <w:tc>
+          <w:tcPr>
+            <w:tcW w:type="dxa" w:w="2160"/>
+            <w:vAlign w:val="center"/>
+          </w:tcPr>
+          <w:p>
+            <w:pPr>
+              <w:spacing w:line="240" w:lineRule="auto" w:after="0"/>
+              <w:jc w:val="left"/>
+            </w:pPr>
+            <w:r>
+              <w:rPr>
+                <w:b w:val="0"/>
+                <w:sz w:val="22"/>
+              </w:rPr>
+              <w:t>Rain 50 mm/h</w:t>
+            </w:r>
+          </w:p>
+        </w:tc>
+        <w:tc>
+          <w:tcPr>
+            <w:tcW w:type="dxa" w:w="1728"/>
+            <w:vAlign w:val="center"/>
+          </w:tcPr>
+          <w:p>
+            <w:pPr>
+              <w:spacing w:line="240" w:lineRule="auto" w:after="0"/>
+              <w:jc w:val="center"/>
+            </w:pPr>
+            <w:r>
+              <w:rPr>
+                <w:b w:val="0"/>
+                <w:sz w:val="22"/>
+              </w:rPr>
+              <w:t>2,011.3</w:t>
+            </w:r>
+          </w:p>
+        </w:tc>
+        <w:tc>
+          <w:tcPr>
+            <w:tcW w:type="dxa" w:w="1728"/>
+            <w:vAlign w:val="center"/>
+          </w:tcPr>
+          <w:p>
+            <w:pPr>
+              <w:spacing w:line="240" w:lineRule="auto" w:after="0"/>
+              <w:jc w:val="center"/>
+            </w:pPr>
+            <w:r>
+              <w:rPr>
+                <w:b w:val="0"/>
+                <w:sz w:val="22"/>
+              </w:rPr>
+              <w:t>70.33</w:t>
+            </w:r>
+          </w:p>
+        </w:tc>
+        <w:tc>
+          <w:tcPr>
+            <w:tcW w:type="dxa" w:w="1656"/>
+            <w:vAlign w:val="center"/>
+          </w:tcPr>
+          <w:p>
+            <w:pPr>
+              <w:spacing w:line="240" w:lineRule="auto" w:after="0"/>
+              <w:jc w:val="center"/>
+            </w:pPr>
+            <w:r>
+              <w:rPr>
+                <w:b w:val="0"/>
+                <w:sz w:val="22"/>
+              </w:rPr>
+              <w:t>10.006</w:t>
+            </w:r>
+          </w:p>
+        </w:tc>
+        <w:tc>
+          <w:tcPr>
+            <w:tcW w:type="dxa" w:w="2088"/>
+            <w:vAlign w:val="center"/>
+          </w:tcPr>
+          <w:p>
+            <w:pPr>
+              <w:spacing w:line="240" w:lineRule="auto" w:after="0"/>
+              <w:jc w:val="center"/>
+            </w:pPr>
+            <w:r>
+              <w:rPr>
+                <w:b w:val="0"/>
+                <w:sz w:val="22"/>
+              </w:rPr>
+              <w:t>100.00</w:t>
+            </w:r>
+          </w:p>
+        </w:tc>
+      </w:tr>
+      <w:tr>
+        <w:trPr>
+          <w:cantSplit/>
+        </w:trPr>
+        <w:tc>
+          <w:tcPr>
+            <w:tcW w:type="dxa" w:w="2160"/>
+            <w:vAlign w:val="center"/>
+          </w:tcPr>
+          <w:p>
+            <w:pPr>
+              <w:spacing w:line="240" w:lineRule="auto" w:after="0"/>
+              <w:jc w:val="left"/>
+            </w:pPr>
+            <w:r>
+              <w:rPr>
+                <w:b w:val="0"/>
+                <w:sz w:val="22"/>
+              </w:rPr>
+              <w:t>Fog κ = 0.6 m⁻¹</w:t>
+            </w:r>
+          </w:p>
+        </w:tc>
+        <w:tc>
+          <w:tcPr>
+            <w:tcW w:type="dxa" w:w="1728"/>
+            <w:vAlign w:val="center"/>
+          </w:tcPr>
+          <w:p>
+            <w:pPr>
+              <w:spacing w:line="240" w:lineRule="auto" w:after="0"/>
+              <w:jc w:val="center"/>
+            </w:pPr>
+            <w:r>
+              <w:rPr>
+                <w:b w:val="0"/>
+                <w:sz w:val="22"/>
+              </w:rPr>
+              <w:t>1,742.0</w:t>
+            </w:r>
+          </w:p>
+        </w:tc>
+        <w:tc>
+          <w:tcPr>
+            <w:tcW w:type="dxa" w:w="1728"/>
+            <w:vAlign w:val="center"/>
+          </w:tcPr>
+          <w:p>
+            <w:pPr>
+              <w:spacing w:line="240" w:lineRule="auto" w:after="0"/>
+              <w:jc w:val="center"/>
+            </w:pPr>
+            <w:r>
+              <w:rPr>
+                <w:b w:val="0"/>
+                <w:sz w:val="22"/>
+              </w:rPr>
+              <w:t>47.10</w:t>
+            </w:r>
+          </w:p>
+        </w:tc>
+        <w:tc>
+          <w:tcPr>
+            <w:tcW w:type="dxa" w:w="1656"/>
+            <w:vAlign w:val="center"/>
+          </w:tcPr>
+          <w:p>
+            <w:pPr>
+              <w:spacing w:line="240" w:lineRule="auto" w:after="0"/>
+              <w:jc w:val="center"/>
+            </w:pPr>
+            <w:r>
+              <w:rPr>
+                <w:b w:val="0"/>
+                <w:sz w:val="22"/>
+              </w:rPr>
+              <w:t>11.139</w:t>
+            </w:r>
+          </w:p>
+        </w:tc>
+        <w:tc>
+          <w:tcPr>
+            <w:tcW w:type="dxa" w:w="2088"/>
+            <w:vAlign w:val="center"/>
+          </w:tcPr>
+          <w:p>
+            <w:pPr>
+              <w:spacing w:line="240" w:lineRule="auto" w:after="0"/>
+              <w:jc w:val="center"/>
+            </w:pPr>
+            <w:r>
+              <w:rPr>
+                <w:b w:val="0"/>
+                <w:sz w:val="22"/>
+              </w:rPr>
+              <w:t>98.07</w:t>
+            </w:r>
+          </w:p>
+        </w:tc>
+      </w:tr>
+    </w:tbl>
+    <w:p>
+      <w:pPr>
+        <w:spacing w:after="20" w:line="20" w:lineRule="exact"/>
+      </w:pPr>
+    </w:p>
+    <w:p>
+      <w:pPr>
+        <w:keepNext/>
+        <w:spacing w:after="40" w:line="240" w:lineRule="auto"/>
+        <w:jc w:val="center"/>
+      </w:pPr>
+      <w:r>
+        <w:drawing>
+          <wp:inline xmlns:a="http://schemas.openxmlformats.org/drawingml/2006/main" xmlns:pic="http://schemas.openxmlformats.org/drawingml/2006/picture">
+            <wp:extent cx="5943600" cy="2377440"/>
+            <wp:docPr id="3" name="Picture 3" descr="Clear, rain and fog measurement profiles at the same baseline poses, including detected target returns, power and pooled cumulative range RMS."/>
+            <wp:cNvGraphicFramePr>
+              <a:graphicFrameLocks noChangeAspect="1"/>
+            </wp:cNvGraphicFramePr>
+            <a:graphic>
+              <a:graphicData uri="http://schemas.openxmlformats.org/drawingml/2006/picture">
+                <pic:pic>
+                  <pic:nvPicPr>
+                    <pic:cNvPr id="0" name="weather_measurements.png"/>
+                    <pic:cNvPicPr/>
+                  </pic:nvPicPr>
+                  <pic:blipFill>
+                    <a:blip r:embed="rId12"/>
+                    <a:stretch>
+                      <a:fillRect/>
+                    </a:stretch>
+                  </pic:blipFill>
+                  <pic:spPr>
+                    <a:xfrm>
+                      <a:off x="0" y="0"/>
+                      <a:ext cx="5943600" cy="2377440"/>
+                    </a:xfrm>
+                    <a:prstGeom prst="rect"/>
+                  </pic:spPr>
+                </pic:pic>
+              </a:graphicData>
+            </a:graphic>
+          </wp:inline>
+        </w:drawing>
+      </w:r>
+    </w:p>
+    <w:p>
+      <w:pPr>
+        <w:pStyle w:val="Caption"/>
+      </w:pPr>
+      <w:r>
+        <w:t>Figure 3  Weather measurement profiles over the same saved baseline poses. Colors denote weather; all three seeds contribute. Cumulative range RMS uses pooled detected-return squared errors and its actual detection denominator. No profile is extended beyond its recorded exposure.</w:t>
+      </w:r>
+    </w:p>
+    <w:p>
+      <w:r>
+        <w:t>Rain and fog reduce mean eligible target power from 0.745081 to 0.575356 and 0.187126 mW. This follows the two-way attenuation term in Equation (7); target geometry and angular sampling are unchanged.</w:t>
+      </w:r>
+    </w:p>
+    <w:p>
+      <w:r>
+        <w:t>Fog lowers mean points per scan by 20.8 percent and observed endpoint coverage by 26.57 percentage points relative to clear air. Target RMS rises from 9.992 to 11.139 mm, while detection falls to 98.07 percent of eligible target echoes. These describe different denominators: whole-scene closed-loop returns, common-region endpoint cells, and detected-target replay errors.</w:t>
+      </w:r>
+    </w:p>
+    <w:p>
+      <w:pPr>
+        <w:spacing w:after="0"/>
+      </w:pPr>
+      <w:r>
+        <w:t>The range floor dominates strong nearby returns, so a substantial optical-power loss can produce a small RMS increase. Detection and coverage expose losses that conditional range RMS alone can conceal. Missing returns remain in the detection denominator; map gaps are not filled using scene truth.</w:t>
       </w:r>
     </w:p>
     <w:p>
@@ -3052,7 +3524,7 @@
         <w:drawing>
           <wp:inline xmlns:a="http://schemas.openxmlformats.org/drawingml/2006/main" xmlns:pic="http://schemas.openxmlformats.org/drawingml/2006/picture">
             <wp:extent cx="5943600" cy="2011680"/>
-            <wp:docPr id="3" name="Picture 3" descr="Three navigation-viewpoint near-threshold detection curves and calibration residuals with pointwise Wilson intervals."/>
+            <wp:docPr id="4" name="Picture 4" descr="Three near-threshold target-ray detection curves and calibration residuals with pointwise Wilson intervals."/>
             <wp:cNvGraphicFramePr>
               <a:graphicFrameLocks noChangeAspect="1"/>
             </wp:cNvGraphicFramePr>
@@ -3064,7 +3536,7 @@
                     <pic:cNvPicPr/>
                   </pic:nvPicPr>
                   <pic:blipFill>
-                    <a:blip r:embed="rId12"/>
+                    <a:blip r:embed="rId13"/>
                     <a:stretch>
                       <a:fillRect/>
                     </a:stretch>
@@ -3088,12 +3560,12 @@
         <w:pStyle w:val="Caption"/>
       </w:pPr>
       <w:r>
-        <w:t>Figure 3  Detection and calibration residuals from 33,000 actual scan trials. Each marker counts 1,000 trials, including misses; bars are pointwise 95% Wilson intervals. Small horizontal offsets distinguish viewpoints. The shaded band is the predicted 5-95% transition, not an uncertainty interval.</w:t>
+        <w:t>Figure 4  Detection and calibration residuals from 33,000 actual scan trials. Each marker counts 1,000 trials, including misses; bars are pointwise 95% Wilson intervals. Small horizontal offsets distinguish viewpoints. The shaded band is the predicted 5-95% transition, not an uncertainty interval.</w:t>
       </w:r>
     </w:p>
     <w:p>
       <w:r>
-        <w:t>The original replays nearly saturate detection. Here extinction changes the mean SNR of three fixed eligible navigation rays; geometry, reflectance, receiver noise, and threshold remain fixed. Ray selection does not depend on noisy detection.</w:t>
+        <w:t>The weather replays nearly saturate detection. For independent component validation, select three eligible rays from this same baseline scene at ranges 7.99, 4.90, and 1.93 m. Vary extinction to obtain 11 mean-SNR settings from 6 to 14, with 1,000 independent actual scans per setting. Geometry, diffuse target response, receiver noise, and threshold remain fixed. Ray selection does not depend on noisy detection; these pencil-ray probes are not additional navigation runs.</w:t>
       </w:r>
     </w:p>
     <w:p>
@@ -3569,7 +4041,7 @@
         <w:pageBreakBefore/>
       </w:pPr>
       <w:r>
-        <w:t>4.4 Repeated navigation and failure boundaries</w:t>
+        <w:t>4.4 Environmental conditions through navigation</w:t>
       </w:r>
     </w:p>
     <w:p>
@@ -3581,8 +4053,8 @@
       <w:r>
         <w:drawing>
           <wp:inline xmlns:a="http://schemas.openxmlformats.org/drawingml/2006/main" xmlns:pic="http://schemas.openxmlformats.org/drawingml/2006/picture">
-            <wp:extent cx="5943600" cy="2560320"/>
-            <wp:docPr id="4" name="Picture 4" descr="720 navigation runs across three fixed layouts: goal fraction intervals, swept clearance distributions and sensor ablations."/>
+            <wp:extent cx="5943600" cy="2743200"/>
+            <wp:docPr id="5" name="Picture 5" descr="All nine recorded weather trajectories in the unchanged three dimensional obstacle scene with a top-down detail."/>
             <wp:cNvGraphicFramePr>
               <a:graphicFrameLocks noChangeAspect="1"/>
             </wp:cNvGraphicFramePr>
@@ -3590,11 +4062,11 @@
               <a:graphicData uri="http://schemas.openxmlformats.org/drawingml/2006/picture">
                 <pic:pic>
                   <pic:nvPicPr>
-                    <pic:cNvPr id="0" name="report_navigation_robustness.png"/>
+                    <pic:cNvPr id="0" name="weather_trajectories.png"/>
                     <pic:cNvPicPr/>
                   </pic:nvPicPr>
                   <pic:blipFill>
-                    <a:blip r:embed="rId13"/>
+                    <a:blip r:embed="rId14"/>
                     <a:stretch>
                       <a:fillRect/>
                     </a:stretch>
@@ -3602,7 +4074,48 @@
                   <pic:spPr>
                     <a:xfrm>
                       <a:off x="0" y="0"/>
-                      <a:ext cx="5943600" cy="2560320"/>
+                      <a:ext cx="5943600" cy="2743200"/>
+                    </a:xfrm>
+                    <a:prstGeom prst="rect"/>
+                  </pic:spPr>
+                </pic:pic>
+              </a:graphicData>
+            </a:graphic>
+          </wp:inline>
+        </w:drawing>
+      </w:r>
+    </w:p>
+    <w:p>
+      <w:pPr>
+        <w:keepNext/>
+        <w:spacing w:after="40" w:line="240" w:lineRule="auto"/>
+        <w:jc w:val="center"/>
+      </w:pPr>
+      <w:r>
+        <w:drawing>
+          <wp:inline xmlns:a="http://schemas.openxmlformats.org/drawingml/2006/main" xmlns:pic="http://schemas.openxmlformats.org/drawingml/2006/picture">
+            <wp:extent cx="5943600" cy="2286000"/>
+            <wp:docPr id="6" name="Picture 6" descr="Recorded weather histories of returns, endpoint coverage, swept clearance and spatial route error, retaining all seeds and true termination times."/>
+            <wp:cNvGraphicFramePr>
+              <a:graphicFrameLocks noChangeAspect="1"/>
+            </wp:cNvGraphicFramePr>
+            <a:graphic>
+              <a:graphicData uri="http://schemas.openxmlformats.org/drawingml/2006/picture">
+                <pic:pic>
+                  <pic:nvPicPr>
+                    <pic:cNvPr id="0" name="weather_profiles.png"/>
+                    <pic:cNvPicPr/>
+                  </pic:nvPicPr>
+                  <pic:blipFill>
+                    <a:blip r:embed="rId15"/>
+                    <a:stretch>
+                      <a:fillRect/>
+                    </a:stretch>
+                  </pic:blipFill>
+                  <pic:spPr>
+                    <a:xfrm>
+                      <a:off x="0" y="0"/>
+                      <a:ext cx="5943600" cy="2286000"/>
                     </a:xfrm>
                     <a:prstGeom prst="rect"/>
                   </pic:spPr>
@@ -3618,7 +4131,7 @@
         <w:pStyle w:val="Caption"/>
       </w:pPr>
       <w:r>
-        <w:t>Figure 4  Frozen 720-run study. Goal bars: pointwise 95% Wilson intervals. Gap: all-run median and interquartile range. Sensor settings: 1.6 m mount, 90 azimuths, 120-degree FOV. Extinction is illustrative optical stress, not calibrated weather.</w:t>
+        <w:t>Figure 5  All nine weather runs in the unchanged scene. Upper: recorded 3D paths and top-down detail. Lower: points per scan, endpoint coverage, swept clearance, and route error. Exact overlaps remain overlaps. Lines stop at recorded termination; terminal poses add no scan. Colors denote weather, line styles seeds.</w:t>
       </w:r>
     </w:p>
     <w:p>
@@ -3626,7 +4139,7 @@
         <w:pStyle w:val="Caption"/>
       </w:pPr>
       <w:r>
-        <w:t>Table 1  Goals/collisions/timeouts; each cell totals 20. All 36 groups are retained in the accompanying results.</w:t>
+        <w:t>Table 2  Three runs per condition; all reach the goal without collision or timeout. Gap is the worst swept clearance. Three seeds are descriptive.</w:t>
       </w:r>
     </w:p>
     <w:tbl>
@@ -3651,10 +4164,11 @@
         </w:tblCellMar>
       </w:tblPr>
       <w:tblGrid>
-        <w:gridCol w:w="2520"/>
-        <w:gridCol w:w="2232"/>
-        <w:gridCol w:w="2376"/>
-        <w:gridCol w:w="2232"/>
+        <w:gridCol w:w="2448"/>
+        <w:gridCol w:w="864"/>
+        <w:gridCol w:w="1944"/>
+        <w:gridCol w:w="2016"/>
+        <w:gridCol w:w="2088"/>
       </w:tblGrid>
       <w:tr>
         <w:trPr>
@@ -3663,7 +4177,7 @@
         </w:trPr>
         <w:tc>
           <w:tcPr>
-            <w:tcW w:type="dxa" w:w="2520"/>
+            <w:tcW w:type="dxa" w:w="2448"/>
             <w:vAlign w:val="center"/>
             <w:shd w:fill="EEEEEE"/>
           </w:tcPr>
@@ -3683,7 +4197,7 @@
         </w:tc>
         <w:tc>
           <w:tcPr>
-            <w:tcW w:type="dxa" w:w="2232"/>
+            <w:tcW w:type="dxa" w:w="864"/>
             <w:vAlign w:val="center"/>
             <w:shd w:fill="EEEEEE"/>
           </w:tcPr>
@@ -3697,13 +4211,13 @@
                 <w:b/>
                 <w:sz w:val="22"/>
               </w:rPr>
-              <w:t>Open G/C/T</w:t>
+              <w:t>Goals</w:t>
             </w:r>
           </w:p>
         </w:tc>
         <w:tc>
           <w:tcPr>
-            <w:tcW w:type="dxa" w:w="2376"/>
+            <w:tcW w:type="dxa" w:w="1944"/>
             <w:vAlign w:val="center"/>
             <w:shd w:fill="EEEEEE"/>
           </w:tcPr>
@@ -3717,13 +4231,13 @@
                 <w:b/>
                 <w:sz w:val="22"/>
               </w:rPr>
-              <w:t>Cluttered G/C/T</w:t>
+              <w:t>Mean time (s)</w:t>
             </w:r>
           </w:p>
         </w:tc>
         <w:tc>
           <w:tcPr>
-            <w:tcW w:type="dxa" w:w="2232"/>
+            <w:tcW w:type="dxa" w:w="2016"/>
             <w:vAlign w:val="center"/>
             <w:shd w:fill="EEEEEE"/>
           </w:tcPr>
@@ -3737,7 +4251,27 @@
                 <w:b/>
                 <w:sz w:val="22"/>
               </w:rPr>
-              <w:t>Narrow G/C/T</w:t>
+              <w:t>Mean path (m)</w:t>
+            </w:r>
+          </w:p>
+        </w:tc>
+        <w:tc>
+          <w:tcPr>
+            <w:tcW w:type="dxa" w:w="2088"/>
+            <w:vAlign w:val="center"/>
+            <w:shd w:fill="EEEEEE"/>
+          </w:tcPr>
+          <w:p>
+            <w:pPr>
+              <w:spacing w:line="240" w:lineRule="auto" w:after="0"/>
+              <w:jc w:val="center"/>
+            </w:pPr>
+            <w:r>
+              <w:rPr>
+                <w:b/>
+                <w:sz w:val="22"/>
+              </w:rPr>
+              <w:t>Min gap (m)</w:t>
             </w:r>
           </w:p>
         </w:tc>
@@ -3748,7 +4282,7 @@
         </w:trPr>
         <w:tc>
           <w:tcPr>
-            <w:tcW w:type="dxa" w:w="2520"/>
+            <w:tcW w:type="dxa" w:w="2448"/>
             <w:vAlign w:val="center"/>
           </w:tcPr>
           <w:p>
@@ -3761,13 +4295,13 @@
                 <w:b w:val="0"/>
                 <w:sz w:val="22"/>
               </w:rPr>
-              <w:t>Baseline</w:t>
+              <w:t>Clear</w:t>
             </w:r>
           </w:p>
         </w:tc>
         <w:tc>
           <w:tcPr>
-            <w:tcW w:type="dxa" w:w="2232"/>
+            <w:tcW w:type="dxa" w:w="864"/>
             <w:vAlign w:val="center"/>
           </w:tcPr>
           <w:p>
@@ -3780,13 +4314,13 @@
                 <w:b w:val="0"/>
                 <w:sz w:val="22"/>
               </w:rPr>
-              <w:t>20/0/0</w:t>
+              <w:t>3/3</w:t>
             </w:r>
           </w:p>
         </w:tc>
         <w:tc>
           <w:tcPr>
-            <w:tcW w:type="dxa" w:w="2376"/>
+            <w:tcW w:type="dxa" w:w="1944"/>
             <w:vAlign w:val="center"/>
           </w:tcPr>
           <w:p>
@@ -3799,13 +4333,13 @@
                 <w:b w:val="0"/>
                 <w:sz w:val="22"/>
               </w:rPr>
-              <w:t>20/0/0</w:t>
+              <w:t>18.07</w:t>
             </w:r>
           </w:p>
         </w:tc>
         <w:tc>
           <w:tcPr>
-            <w:tcW w:type="dxa" w:w="2232"/>
+            <w:tcW w:type="dxa" w:w="2016"/>
             <w:vAlign w:val="center"/>
           </w:tcPr>
           <w:p>
@@ -3818,7 +4352,26 @@
                 <w:b w:val="0"/>
                 <w:sz w:val="22"/>
               </w:rPr>
-              <w:t>19/0/1</w:t>
+              <w:t>19.702</w:t>
+            </w:r>
+          </w:p>
+        </w:tc>
+        <w:tc>
+          <w:tcPr>
+            <w:tcW w:type="dxa" w:w="2088"/>
+            <w:vAlign w:val="center"/>
+          </w:tcPr>
+          <w:p>
+            <w:pPr>
+              <w:spacing w:line="240" w:lineRule="auto" w:after="0"/>
+              <w:jc w:val="center"/>
+            </w:pPr>
+            <w:r>
+              <w:rPr>
+                <w:b w:val="0"/>
+                <w:sz w:val="22"/>
+              </w:rPr>
+              <w:t>0.330</w:t>
             </w:r>
           </w:p>
         </w:tc>
@@ -3829,7 +4382,7 @@
         </w:trPr>
         <w:tc>
           <w:tcPr>
-            <w:tcW w:type="dxa" w:w="2520"/>
+            <w:tcW w:type="dxa" w:w="2448"/>
             <w:vAlign w:val="center"/>
           </w:tcPr>
           <w:p>
@@ -3842,13 +4395,13 @@
                 <w:b w:val="0"/>
                 <w:sz w:val="22"/>
               </w:rPr>
-              <w:t>κ = 10 m⁻¹</w:t>
+              <w:t>Rain 50 mm/h</w:t>
             </w:r>
           </w:p>
         </w:tc>
         <w:tc>
           <w:tcPr>
-            <w:tcW w:type="dxa" w:w="2232"/>
+            <w:tcW w:type="dxa" w:w="864"/>
             <w:vAlign w:val="center"/>
           </w:tcPr>
           <w:p>
@@ -3861,13 +4414,13 @@
                 <w:b w:val="0"/>
                 <w:sz w:val="22"/>
               </w:rPr>
-              <w:t>0/0/20</w:t>
+              <w:t>3/3</w:t>
             </w:r>
           </w:p>
         </w:tc>
         <w:tc>
           <w:tcPr>
-            <w:tcW w:type="dxa" w:w="2376"/>
+            <w:tcW w:type="dxa" w:w="1944"/>
             <w:vAlign w:val="center"/>
           </w:tcPr>
           <w:p>
@@ -3880,13 +4433,13 @@
                 <w:b w:val="0"/>
                 <w:sz w:val="22"/>
               </w:rPr>
-              <w:t>0/0/20</w:t>
+              <w:t>18.07</w:t>
             </w:r>
           </w:p>
         </w:tc>
         <w:tc>
           <w:tcPr>
-            <w:tcW w:type="dxa" w:w="2232"/>
+            <w:tcW w:type="dxa" w:w="2016"/>
             <w:vAlign w:val="center"/>
           </w:tcPr>
           <w:p>
@@ -3899,7 +4452,26 @@
                 <w:b w:val="0"/>
                 <w:sz w:val="22"/>
               </w:rPr>
-              <w:t>0/0/20</w:t>
+              <w:t>19.702</w:t>
+            </w:r>
+          </w:p>
+        </w:tc>
+        <w:tc>
+          <w:tcPr>
+            <w:tcW w:type="dxa" w:w="2088"/>
+            <w:vAlign w:val="center"/>
+          </w:tcPr>
+          <w:p>
+            <w:pPr>
+              <w:spacing w:line="240" w:lineRule="auto" w:after="0"/>
+              <w:jc w:val="center"/>
+            </w:pPr>
+            <w:r>
+              <w:rPr>
+                <w:b w:val="0"/>
+                <w:sz w:val="22"/>
+              </w:rPr>
+              <w:t>0.330</w:t>
             </w:r>
           </w:p>
         </w:tc>
@@ -3910,7 +4482,7 @@
         </w:trPr>
         <w:tc>
           <w:tcPr>
-            <w:tcW w:type="dxa" w:w="2520"/>
+            <w:tcW w:type="dxa" w:w="2448"/>
             <w:vAlign w:val="center"/>
           </w:tcPr>
           <w:p>
@@ -3923,13 +4495,13 @@
                 <w:b w:val="0"/>
                 <w:sz w:val="22"/>
               </w:rPr>
-              <w:t>Mount 1.6 m</w:t>
+              <w:t>Fog κ = 0.6 m⁻¹</w:t>
             </w:r>
           </w:p>
         </w:tc>
         <w:tc>
           <w:tcPr>
-            <w:tcW w:type="dxa" w:w="2232"/>
+            <w:tcW w:type="dxa" w:w="864"/>
             <w:vAlign w:val="center"/>
           </w:tcPr>
           <w:p>
@@ -3942,13 +4514,13 @@
                 <w:b w:val="0"/>
                 <w:sz w:val="22"/>
               </w:rPr>
-              <w:t>0/20/0</w:t>
+              <w:t>3/3</w:t>
             </w:r>
           </w:p>
         </w:tc>
         <w:tc>
           <w:tcPr>
-            <w:tcW w:type="dxa" w:w="2376"/>
+            <w:tcW w:type="dxa" w:w="1944"/>
             <w:vAlign w:val="center"/>
           </w:tcPr>
           <w:p>
@@ -3961,13 +4533,13 @@
                 <w:b w:val="0"/>
                 <w:sz w:val="22"/>
               </w:rPr>
-              <w:t>19/1/0</w:t>
+              <w:t>17.93</w:t>
             </w:r>
           </w:p>
         </w:tc>
         <w:tc>
           <w:tcPr>
-            <w:tcW w:type="dxa" w:w="2232"/>
+            <w:tcW w:type="dxa" w:w="2016"/>
             <w:vAlign w:val="center"/>
           </w:tcPr>
           <w:p>
@@ -3980,37 +4552,13 @@
                 <w:b w:val="0"/>
                 <w:sz w:val="22"/>
               </w:rPr>
-              <w:t>0/20/0</w:t>
-            </w:r>
-          </w:p>
-        </w:tc>
-      </w:tr>
-      <w:tr>
-        <w:trPr>
-          <w:cantSplit/>
-        </w:trPr>
-        <w:tc>
-          <w:tcPr>
-            <w:tcW w:type="dxa" w:w="2520"/>
-            <w:vAlign w:val="center"/>
-          </w:tcPr>
-          <w:p>
-            <w:pPr>
-              <w:spacing w:line="240" w:lineRule="auto" w:after="0"/>
-              <w:jc w:val="left"/>
-            </w:pPr>
-            <w:r>
-              <w:rPr>
-                <w:b w:val="0"/>
-                <w:sz w:val="22"/>
-              </w:rPr>
-              <w:t>Side FOV 120°</w:t>
+              <w:t>19.784</w:t>
             </w:r>
           </w:p>
         </w:tc>
         <w:tc>
           <w:tcPr>
-            <w:tcW w:type="dxa" w:w="2232"/>
+            <w:tcW w:type="dxa" w:w="2088"/>
             <w:vAlign w:val="center"/>
           </w:tcPr>
           <w:p>
@@ -4023,126 +4571,7 @@
                 <w:b w:val="0"/>
                 <w:sz w:val="22"/>
               </w:rPr>
-              <w:t>0/20/0</w:t>
-            </w:r>
-          </w:p>
-        </w:tc>
-        <w:tc>
-          <w:tcPr>
-            <w:tcW w:type="dxa" w:w="2376"/>
-            <w:vAlign w:val="center"/>
-          </w:tcPr>
-          <w:p>
-            <w:pPr>
-              <w:spacing w:line="240" w:lineRule="auto" w:after="0"/>
-              <w:jc w:val="center"/>
-            </w:pPr>
-            <w:r>
-              <w:rPr>
-                <w:b w:val="0"/>
-                <w:sz w:val="22"/>
-              </w:rPr>
-              <w:t>0/20/0</w:t>
-            </w:r>
-          </w:p>
-        </w:tc>
-        <w:tc>
-          <w:tcPr>
-            <w:tcW w:type="dxa" w:w="2232"/>
-            <w:vAlign w:val="center"/>
-          </w:tcPr>
-          <w:p>
-            <w:pPr>
-              <w:spacing w:line="240" w:lineRule="auto" w:after="0"/>
-              <w:jc w:val="center"/>
-            </w:pPr>
-            <w:r>
-              <w:rPr>
-                <w:b w:val="0"/>
-                <w:sz w:val="22"/>
-              </w:rPr>
-              <w:t>0/20/0</w:t>
-            </w:r>
-          </w:p>
-        </w:tc>
-      </w:tr>
-      <w:tr>
-        <w:trPr>
-          <w:cantSplit/>
-        </w:trPr>
-        <w:tc>
-          <w:tcPr>
-            <w:tcW w:type="dxa" w:w="2520"/>
-            <w:vAlign w:val="center"/>
-          </w:tcPr>
-          <w:p>
-            <w:pPr>
-              <w:spacing w:line="240" w:lineRule="auto" w:after="0"/>
-              <w:jc w:val="left"/>
-            </w:pPr>
-            <w:r>
-              <w:rPr>
-                <w:b w:val="0"/>
-                <w:sz w:val="22"/>
-              </w:rPr>
-              <w:t>LiDAR disabled</w:t>
-            </w:r>
-          </w:p>
-        </w:tc>
-        <w:tc>
-          <w:tcPr>
-            <w:tcW w:type="dxa" w:w="2232"/>
-            <w:vAlign w:val="center"/>
-          </w:tcPr>
-          <w:p>
-            <w:pPr>
-              <w:spacing w:line="240" w:lineRule="auto" w:after="0"/>
-              <w:jc w:val="center"/>
-            </w:pPr>
-            <w:r>
-              <w:rPr>
-                <w:b w:val="0"/>
-                <w:sz w:val="22"/>
-              </w:rPr>
-              <w:t>0/20/0</w:t>
-            </w:r>
-          </w:p>
-        </w:tc>
-        <w:tc>
-          <w:tcPr>
-            <w:tcW w:type="dxa" w:w="2376"/>
-            <w:vAlign w:val="center"/>
-          </w:tcPr>
-          <w:p>
-            <w:pPr>
-              <w:spacing w:line="240" w:lineRule="auto" w:after="0"/>
-              <w:jc w:val="center"/>
-            </w:pPr>
-            <w:r>
-              <w:rPr>
-                <w:b w:val="0"/>
-                <w:sz w:val="22"/>
-              </w:rPr>
-              <w:t>0/20/0</w:t>
-            </w:r>
-          </w:p>
-        </w:tc>
-        <w:tc>
-          <w:tcPr>
-            <w:tcW w:type="dxa" w:w="2232"/>
-            <w:vAlign w:val="center"/>
-          </w:tcPr>
-          <w:p>
-            <w:pPr>
-              <w:spacing w:line="240" w:lineRule="auto" w:after="0"/>
-              <w:jc w:val="center"/>
-            </w:pPr>
-            <w:r>
-              <w:rPr>
-                <w:b w:val="0"/>
-                <w:sz w:val="22"/>
-              </w:rPr>
-              <w:t>0/20/0</w:t>
+              <w:t>0.345</w:t>
             </w:r>
           </w:p>
         </w:tc>
@@ -4152,19 +4581,6 @@
       <w:pPr>
         <w:spacing w:after="20" w:line="20" w:lineRule="exact"/>
       </w:pPr>
-    </w:p>
-    <w:p>
-      <w:r>
-        <w:t>Baseline reaches 59/60 goals. Wilson intervals remain [0.839, 1.000] for 20/20 and [0.000, 0.161] for 0/20; one whole run is the unit. These pointwise intervals apply to fixed layouts and this controller, not new random environments. Side FOV rotates the matched front window by 90 degrees.</w:t>
-      </w:r>
-    </w:p>
-    <w:p>
-      <w:pPr>
-        <w:spacing w:after="0"/>
-      </w:pPr>
-      <w:r>
-        <w:t>At κ = 10 m⁻¹, the open representative stalls from 8.6 to 36 s despite nearby returns. Open-layout outcomes at κ = 1.2 (19/20) and 3 m⁻¹ (20/20) have overlapping intervals, without establishing monotonic task reliability. Time/path summaries condition on success; paired time differences require both successes. Clearance retains failures. Poses are exact, objects static, and scans snapshots.</w:t>
-      </w:r>
     </w:p>
     <w:p>
       <w:pPr>
@@ -4184,8 +4600,8 @@
       <w:r>
         <w:drawing>
           <wp:inline xmlns:a="http://schemas.openxmlformats.org/drawingml/2006/main" xmlns:pic="http://schemas.openxmlformats.org/drawingml/2006/picture">
-            <wp:extent cx="5158596" cy="2103120"/>
-            <wp:docPr id="5" name="Picture 5" descr="Measured 3D endpoint maps and executed trajectories in clear air and optical stress, with a shared planned reference."/>
+            <wp:extent cx="5943600" cy="2011680"/>
+            <wp:docPr id="7" name="Picture 7" descr="Measured three dimensional endpoint maps in clear air, rain and fog, sharing physical axes and height colors."/>
             <wp:cNvGraphicFramePr>
               <a:graphicFrameLocks noChangeAspect="1"/>
             </wp:cNvGraphicFramePr>
@@ -4193,11 +4609,11 @@
               <a:graphicData uri="http://schemas.openxmlformats.org/drawingml/2006/picture">
                 <pic:pic>
                   <pic:nvPicPr>
-                    <pic:cNvPr id="0" name="report_navigation_maps.png"/>
+                    <pic:cNvPr id="0" name="weather_maps.png"/>
                     <pic:cNvPicPr/>
                   </pic:nvPicPr>
                   <pic:blipFill>
-                    <a:blip r:embed="rId14"/>
+                    <a:blip r:embed="rId16"/>
                     <a:stretch>
                       <a:fillRect/>
                     </a:stretch>
@@ -4205,7 +4621,7 @@
                   <pic:spPr>
                     <a:xfrm>
                       <a:off x="0" y="0"/>
-                      <a:ext cx="5158596" cy="2103120"/>
+                      <a:ext cx="5943600" cy="2011680"/>
                     </a:xfrm>
                     <a:prstGeom prst="rect"/>
                   </pic:spPr>
@@ -4221,7 +4637,7 @@
         <w:pStyle w:val="Caption"/>
       </w:pPr>
       <w:r>
-        <w:t>Figure 5  Seed-1 measured maps: black driven path, orange shared reference, height colors. Display hides z ≤ 0.12 m. Each map ends with its run; no scene truth is drawn.</w:t>
+        <w:t>Figure 6  Seed-1 measured maps for clear air, rain, and fog in the same fixed scene. Colors show height; all panels use the same axes and height scale. Display hides z ≤ 0.12 m. Each map ends with its own run; no true scene surfaces fill gaps.</w:t>
       </w:r>
     </w:p>
     <w:p>
@@ -4376,12 +4792,12 @@
     </w:p>
     <w:p>
       <w:r>
-        <w:t>Primary-task attenuation reduces mean observed cells from 73.7 to 47.1 percent despite three successful runs. Endpoint counts do not establish accuracy or free space. Collision uses swept gap ≤ 0; goal tolerance is 0.35 m.</w:t>
+        <w:t>Mean observed endpoint cells are 73.67 percent in clear air, 70.33 in rain, and 47.10 in fog. All weather runs reach the goal; endpoint observations do not establish accuracy or free space.</w:t>
       </w:r>
     </w:p>
     <w:p>
       <w:r>
-        <w:t>Independent numerical checks additionally cover 65 geometry and 72 power cases, with maximum residuals 3.83e-13 m and 4.39e-16 relative power.</w:t>
+        <w:t>Independent checks cover 65 geometry and 72 power cases; maximum residuals are 3.83e-13 m and 4.39e-16 relative power.</w:t>
       </w:r>
     </w:p>
     <w:p>
@@ -4394,7 +4810,7 @@
     </w:p>
     <w:p>
       <w:r>
-        <w:t>Controlled replays expose LiDAR dependencies; threshold trials verify probabilistic behavior; 720 navigation runs reveal collisions and timeouts. Goal completion does not imply complete perception. Results support the virtual model within its assumptions. Physical calibration, backscatter, pose uncertainty, navigation scan motion, and latency remain future work.</w:t>
+        <w:t>Target replays expose surface response and geometric sampling. With obstacles fixed, attenuation reduces returns and coverage and increases conditional range error, although all nine weather runs succeed. Threshold trials support the assumed noise model. Three seeds do not establish navigation reliability. Physical calibration, backscatter, pose uncertainty, moving objects, and scan motion remain future work.</w:t>
       </w:r>
     </w:p>
     <w:p>

</xml_diff>

<commit_message>
Evaluate fixed-angle sampling and target reflectance in all deliverables
</commit_message>
<xml_diff>
--- a/outputs/reports/Midterm_Project_Report.docx
+++ b/outputs/reports/Midterm_Project_Report.docx
@@ -71,6 +71,317 @@
     </w:p>
     <w:p>
       <w:pPr>
+        <w:spacing w:line="720" w:lineRule="exact" w:after="0" w:before="0"/>
+      </w:pPr>
+      <w:r>
+        <w:t xml:space="preserve"> </w:t>
+      </w:r>
+    </w:p>
+    <w:p>
+      <w:pPr>
+        <w:pStyle w:val="Caption"/>
+      </w:pPr>
+      <w:r>
+        <w:t>Project evidence guide</w:t>
+      </w:r>
+    </w:p>
+    <w:tbl>
+      <w:tblPr>
+        <w:tblW w:type="auto" w:w="0"/>
+        <w:jc w:val="center"/>
+        <w:tblLayout w:type="fixed"/>
+        <w:tblLook w:firstColumn="1" w:firstRow="1" w:lastColumn="0" w:lastRow="0" w:noHBand="0" w:noVBand="1" w:val="04A0"/>
+        <w:tblBorders>
+          <w:top w:val="single" w:sz="4" w:color="D9D9D9"/>
+          <w:left w:val="single" w:sz="4" w:color="D9D9D9"/>
+          <w:bottom w:val="single" w:sz="4" w:color="D9D9D9"/>
+          <w:right w:val="single" w:sz="4" w:color="D9D9D9"/>
+          <w:insideH w:val="single" w:sz="4" w:color="D9D9D9"/>
+          <w:insideV w:val="single" w:sz="4" w:color="D9D9D9"/>
+        </w:tblBorders>
+        <w:tblCellMar>
+          <w:top w:w="30" w:type="dxa"/>
+          <w:left w:w="90" w:type="dxa"/>
+          <w:bottom w:w="30" w:type="dxa"/>
+          <w:right w:w="90" w:type="dxa"/>
+        </w:tblCellMar>
+      </w:tblPr>
+      <w:tblGrid>
+        <w:gridCol w:w="2880"/>
+        <w:gridCol w:w="6480"/>
+      </w:tblGrid>
+      <w:tr>
+        <w:trPr>
+          <w:cantSplit/>
+          <w:tblHeader/>
+        </w:trPr>
+        <w:tc>
+          <w:tcPr>
+            <w:tcW w:type="dxa" w:w="2880"/>
+            <w:vAlign w:val="center"/>
+            <w:shd w:fill="EEEEEE"/>
+          </w:tcPr>
+          <w:p>
+            <w:pPr>
+              <w:spacing w:line="240" w:lineRule="auto" w:after="0"/>
+              <w:jc w:val="left"/>
+            </w:pPr>
+            <w:r>
+              <w:rPr>
+                <w:b/>
+                <w:sz w:val="22"/>
+              </w:rPr>
+              <w:t>Requirement</w:t>
+            </w:r>
+          </w:p>
+        </w:tc>
+        <w:tc>
+          <w:tcPr>
+            <w:tcW w:type="dxa" w:w="6480"/>
+            <w:vAlign w:val="center"/>
+            <w:shd w:fill="EEEEEE"/>
+          </w:tcPr>
+          <w:p>
+            <w:pPr>
+              <w:spacing w:line="240" w:lineRule="auto" w:after="0"/>
+              <w:jc w:val="center"/>
+            </w:pPr>
+            <w:r>
+              <w:rPr>
+                <w:b/>
+                <w:sz w:val="22"/>
+              </w:rPr>
+              <w:t>Report evidence</w:t>
+            </w:r>
+          </w:p>
+        </w:tc>
+      </w:tr>
+      <w:tr>
+        <w:trPr>
+          <w:cantSplit/>
+        </w:trPr>
+        <w:tc>
+          <w:tcPr>
+            <w:tcW w:type="dxa" w:w="2880"/>
+            <w:vAlign w:val="center"/>
+          </w:tcPr>
+          <w:p>
+            <w:pPr>
+              <w:spacing w:line="240" w:lineRule="auto" w:after="0"/>
+              <w:jc w:val="left"/>
+            </w:pPr>
+            <w:r>
+              <w:rPr>
+                <w:b w:val="0"/>
+                <w:sz w:val="22"/>
+              </w:rPr>
+              <w:t>Physical model</w:t>
+            </w:r>
+          </w:p>
+        </w:tc>
+        <w:tc>
+          <w:tcPr>
+            <w:tcW w:type="dxa" w:w="6480"/>
+            <w:vAlign w:val="center"/>
+          </w:tcPr>
+          <w:p>
+            <w:pPr>
+              <w:spacing w:line="240" w:lineRule="auto" w:after="0"/>
+              <w:jc w:val="center"/>
+            </w:pPr>
+            <w:r>
+              <w:rPr>
+                <w:b w:val="0"/>
+                <w:sz w:val="22"/>
+              </w:rPr>
+              <w:t>Section 2; Figures 1, 3, 5</w:t>
+            </w:r>
+          </w:p>
+        </w:tc>
+      </w:tr>
+      <w:tr>
+        <w:trPr>
+          <w:cantSplit/>
+        </w:trPr>
+        <w:tc>
+          <w:tcPr>
+            <w:tcW w:type="dxa" w:w="2880"/>
+            <w:vAlign w:val="center"/>
+          </w:tcPr>
+          <w:p>
+            <w:pPr>
+              <w:spacing w:line="240" w:lineRule="auto" w:after="0"/>
+              <w:jc w:val="left"/>
+            </w:pPr>
+            <w:r>
+              <w:rPr>
+                <w:b w:val="0"/>
+                <w:sz w:val="22"/>
+              </w:rPr>
+              <w:t>Virtual simulation</w:t>
+            </w:r>
+          </w:p>
+        </w:tc>
+        <w:tc>
+          <w:tcPr>
+            <w:tcW w:type="dxa" w:w="6480"/>
+            <w:vAlign w:val="center"/>
+          </w:tcPr>
+          <w:p>
+            <w:pPr>
+              <w:spacing w:line="240" w:lineRule="auto" w:after="0"/>
+              <w:jc w:val="center"/>
+            </w:pPr>
+            <w:r>
+              <w:rPr>
+                <w:b w:val="0"/>
+                <w:sz w:val="22"/>
+              </w:rPr>
+              <w:t>Section 3; Python implementation and saved runs</w:t>
+            </w:r>
+          </w:p>
+        </w:tc>
+      </w:tr>
+      <w:tr>
+        <w:trPr>
+          <w:cantSplit/>
+        </w:trPr>
+        <w:tc>
+          <w:tcPr>
+            <w:tcW w:type="dxa" w:w="2880"/>
+            <w:vAlign w:val="center"/>
+          </w:tcPr>
+          <w:p>
+            <w:pPr>
+              <w:spacing w:line="240" w:lineRule="auto" w:after="0"/>
+              <w:jc w:val="left"/>
+            </w:pPr>
+            <w:r>
+              <w:rPr>
+                <w:b w:val="0"/>
+                <w:sz w:val="22"/>
+              </w:rPr>
+              <w:t>Dependencies and media</w:t>
+            </w:r>
+          </w:p>
+        </w:tc>
+        <w:tc>
+          <w:tcPr>
+            <w:tcW w:type="dxa" w:w="6480"/>
+            <w:vAlign w:val="center"/>
+          </w:tcPr>
+          <w:p>
+            <w:pPr>
+              <w:spacing w:line="240" w:lineRule="auto" w:after="0"/>
+              <w:jc w:val="center"/>
+            </w:pPr>
+            <w:r>
+              <w:rPr>
+                <w:b w:val="0"/>
+                <w:sz w:val="22"/>
+              </w:rPr>
+              <w:t>Section 4; Figures 1-7 and three videos</w:t>
+            </w:r>
+          </w:p>
+        </w:tc>
+      </w:tr>
+      <w:tr>
+        <w:trPr>
+          <w:cantSplit/>
+        </w:trPr>
+        <w:tc>
+          <w:tcPr>
+            <w:tcW w:type="dxa" w:w="2880"/>
+            <w:vAlign w:val="center"/>
+          </w:tcPr>
+          <w:p>
+            <w:pPr>
+              <w:spacing w:line="240" w:lineRule="auto" w:after="0"/>
+              <w:jc w:val="left"/>
+            </w:pPr>
+            <w:r>
+              <w:rPr>
+                <w:b w:val="0"/>
+                <w:sz w:val="22"/>
+              </w:rPr>
+              <w:t>Technical analysis</w:t>
+            </w:r>
+          </w:p>
+        </w:tc>
+        <w:tc>
+          <w:tcPr>
+            <w:tcW w:type="dxa" w:w="6480"/>
+            <w:vAlign w:val="center"/>
+          </w:tcPr>
+          <w:p>
+            <w:pPr>
+              <w:spacing w:line="240" w:lineRule="auto" w:after="0"/>
+              <w:jc w:val="center"/>
+            </w:pPr>
+            <w:r>
+              <w:rPr>
+                <w:b w:val="0"/>
+                <w:sz w:val="22"/>
+              </w:rPr>
+              <w:t>Sections 4-5; model checks and limitations</w:t>
+            </w:r>
+          </w:p>
+        </w:tc>
+      </w:tr>
+    </w:tbl>
+    <w:p>
+      <w:pPr>
+        <w:spacing w:after="20" w:line="20" w:lineRule="exact"/>
+      </w:pPr>
+    </w:p>
+    <w:p>
+      <w:pPr>
+        <w:pStyle w:val="Caption"/>
+      </w:pPr>
+      <w:r>
+        <w:t>Companion videos in simulalted_environments</w:t>
+      </w:r>
+    </w:p>
+    <w:p>
+      <w:hyperlink r:id="rId10">
+        <w:r>
+          <w:rPr>
+            <w:rFonts w:ascii="Times New Roman" w:hAnsi="Times New Roman"/>
+            <w:color w:val="000000"/>
+            <w:u w:val="single"/>
+          </w:rPr>
+          <w:t>environment_conditions.mp4</w:t>
+        </w:r>
+      </w:hyperlink>
+      <w:r>
+        <w:t xml:space="preserve">; </w:t>
+      </w:r>
+      <w:hyperlink r:id="rId11">
+        <w:r>
+          <w:rPr>
+            <w:rFonts w:ascii="Times New Roman" w:hAnsi="Times New Roman"/>
+            <w:color w:val="000000"/>
+            <w:u w:val="single"/>
+          </w:rPr>
+          <w:t>sensor_state_best_vs_worst.mp4</w:t>
+        </w:r>
+      </w:hyperlink>
+      <w:r>
+        <w:t xml:space="preserve">; </w:t>
+      </w:r>
+      <w:hyperlink r:id="rId12">
+        <w:r>
+          <w:rPr>
+            <w:rFonts w:ascii="Times New Roman" w:hAnsi="Times New Roman"/>
+            <w:color w:val="000000"/>
+            <w:u w:val="single"/>
+          </w:rPr>
+          <w:t>sampling_reflectance_factorial.mp4</w:t>
+        </w:r>
+      </w:hyperlink>
+    </w:p>
+    <w:p>
+      <w:pPr>
         <w:pStyle w:val="Heading1"/>
         <w:pageBreakBefore/>
       </w:pPr>
@@ -80,7 +391,7 @@
     </w:p>
     <w:p>
       <w:r>
-        <w:t>This project models a spinning three dimensional pulsed LiDAR with opaque visibility, surface response, attenuation, and receiver noise. Evaluation has two parts: nine target-characteristic settings at matched robot poses, and clear air, rain, and fog navigation in one fixed obstacle setup. Nine recorded weather runs retain all trajectories and measurement profiles. Attenuation reduces mean observed endpoint cells from 73.7 to 47.1 percent while all nine runs reach the goal. An independent 33,000-trial experiment checks detection near threshold; probability calibration RMS error is 0.55 percentage points. These results establish internal model consistency and conditional environmental dependencies. Three navigation seeds are descriptive; physical calibration and general reliability remain untested.</w:t>
+        <w:t>This project models a spinning three dimensional pulsed LiDAR with opaque visibility, surface response, attenuation, and receiver noise. Analytic pose checks, a four-case sampling and reflectance experiment, nine target settings, and fixed-scene weather navigation demonstrate the measurement dependencies. Mounting angles remain unchanged in the sampling and reflectance comparison. Fog reduces observed endpoint cells from 73.7 to 47.1 percent, although all nine weather runs reach the goal. An independent 33,000-trial threshold experiment gives probability calibration RMS error 0.55 percentage points. Figures, recorded histories, and three videos connect the model to simulation results. These checks establish internal consistency; physical calibration and general navigation reliability remain untested.</w:t>
       </w:r>
     </w:p>
     <w:p>
@@ -98,7 +409,7 @@
     </w:p>
     <w:p>
       <w:r>
-        <w:t>The navigation sensor uses eight channels. Surface modeling is motivated by Heiden et al. [2], whose continuous wave phase estimator differs from this pulsed geometric approximation. Target experiments quantify geometric exposure and surface response; weather experiments hold the physical scene, robot, sensor, reference route, and controller fixed. Threshold trials resolve uncertain detections independently of navigation.</w:t>
+        <w:t>The navigation sensor uses eight channels. Surface modeling is motivated by Heiden et al. [2], whose continuous wave phase estimator differs from this pulsed geometric approximation. Pose, sampling, target, and weather comparisons isolate different mechanisms. Threshold trials resolve uncertain detections independently of navigation.</w:t>
       </w:r>
     </w:p>
     <w:p>
@@ -2407,17 +2718,17 @@
     </w:p>
     <w:p>
       <w:r>
-        <w:t>Python and NumPy generate measurements; independent renderers read saved results. The fixed navigation scene has 12 objects: nine in the planning map and three unknown to the planner. Its designated target is a pure diffuse box centered at (11, 1.1, 0.6) m, sized (0.8, 1.6, 1.2) m, with diffuse weight 0.30.</w:t>
+        <w:t>Python and NumPy generate measurements; independent renderers read saved results. The fixed scene has 12 objects: nine in the planning map and three unknown to the planner. A diffuse study box is centered at (11, 1.1, 0.6) m with size (0.8, 1.6, 1.2) m and baseline weight 0.30.</w:t>
       </w:r>
     </w:p>
     <w:p>
       <w:r>
-        <w:t>The sensor uses eight channels from -20 to +10 degrees, 360 azimuths, one subray, a level 0.6 m mount, and 0.5-200 m gates. Parameters are 75 W peak power, 25 mm aperture, 0.5 efficiency, 4 × 10⁻⁹ W power noise RMS, threshold factor 10, 0.01 m range floor, 5 ns pulse, and 1 ns rise time.</w:t>
+        <w:t>Defaults are eight channels (-20 to +10 degrees), 360 azimuths, one subray, level mount at 0.6 m, 0.5-200 m gates, 75 W peak power, 25 mm aperture, 0.5 efficiency, 4 × 10⁻⁹ W power noise, threshold factor 10, 0.01 m range floor, 5 ns pulse, and 1 ns rise time.</w:t>
       </w:r>
     </w:p>
     <w:p>
       <w:r>
-        <w:t>A* supplies a shared reference from (0, 0) to (18, 0) m on a 0.25 m grid, with 0.90 m total inflation. The measured-point controller uses 0.12 ≤ z ≤ 1 m without object labels. Limits are 1.2 m/s, 90 degrees/s, 0.2 s steps, and 36 s. Forward Euler integrates</w:t>
+        <w:t>A* plans from (0, 0) to (18, 0) m on a 0.25 m grid with 0.90 m inflation. A label-free measured-point controller uses 0.12 ≤ z ≤ 1 m; limits are 1.2 m/s and 90 degrees/s. At 0.2 s steps, up to 36 s,</w:t>
       </w:r>
     </w:p>
     <w:p>
@@ -2660,12 +2971,25 @@
         <w:pStyle w:val="Heading2"/>
       </w:pPr>
       <w:r>
-        <w:t>3.1 Target characteristics</w:t>
+        <w:t>3.1 Sensor state and sensor configuration</w:t>
       </w:r>
     </w:p>
     <w:p>
       <w:r>
-        <w:t>Nine target settings vary diffuse weight (0.02, 0.30, 0.85), yaw (0, 45, 75 degrees), height (0.3, 1.2, 2.0 m), and center x (9, 11, 13 m). Each is replayed at the same 271 baseline snapshots across three seeds. The shared baseline appears in both evaluation parts. Count target intersections, nearest visible hits, in-gate eligible echoes NE, and detections ND separately. For qi from Equation (9),</w:t>
+        <w:t>State means position and orientation; sampling and noise are configuration parameters. A ground-height check changes position at fixed angles. The new factorial combines M = 360 or 90 with target diffuse weight 0.85 or 0.00005, keeping mounting angles, environment, geometry, route, and control settings fixed. The weak weight is a virtual stress setting. Each case has three navigation seeds and matched baseline-pose replays. A separate noise case increases σP tenfold.</w:t>
+      </w:r>
+    </w:p>
+    <w:p>
+      <w:pPr>
+        <w:pStyle w:val="Heading2"/>
+      </w:pPr>
+      <w:r>
+        <w:t>3.2 Target characteristics</w:t>
+      </w:r>
+    </w:p>
+    <w:p>
+      <w:r>
+        <w:t>Nine settings vary diffuse weight (0.02, 0.30, 0.85), yaw (0, 45, 75 degrees), height (0.3, 1.2, 2.0 m), and center x (9, 11, 13 m). Reuse the same 271 baseline snapshots across three seeds. Count intersections, visible hits, in-gate eligible echoes NE, and detections ND separately. For qi in Equation (9),</w:t>
       </w:r>
     </w:p>
     <w:p>
@@ -2842,12 +3166,7 @@
         <w:pStyle w:val="Heading2"/>
       </w:pPr>
       <w:r>
-        <w:t>3.2 Environmental conditions through navigation</w:t>
-      </w:r>
-    </w:p>
-    <w:p>
-      <w:r>
-        <w:t>Hold all obstacle geometry, target properties, sensor settings, robot parameters, controller, and reference route fixed. Compare clear air (κ = 0.0002 m⁻¹), rain at 50 mm/h (effective κ = 0.104764 m⁻¹), and fog represented by κ = 0.6 m⁻¹. Each condition uses seeds 1-3: nine closed-loop runs and nine matched-pose replays, including the shared baseline. All recorded trajectories and metric histories are retained.</w:t>
+        <w:t>3.3 Environmental conditions through navigation</w:t>
       </w:r>
     </w:p>
     <w:p>
@@ -2855,7 +3174,7 @@
         <w:spacing w:after="0"/>
       </w:pPr>
       <w:r>
-        <w:t>Points per scan include all detected surfaces. Mapping reports endpoint-observed cells, not free space or accuracy. Target range RMS pools squared errors over detected replay returns; misses are not zero errors. Weather coefficients are illustrative attenuation settings; no backscatter or false weather returns are modeled. Three navigation seeds provide descriptive comparisons, not a reliability estimate.</w:t>
+        <w:t>With obstacles, target, sensing, controller, and reference fixed, compare normal air (κ = 0.0002 m⁻¹), rain at 50 mm/h (κ = 0.104764 m⁻¹), and fog (κ = 0.6 m⁻¹), each at seeds 1-3. Retain all nine closed-loop histories and matched-pose replays. Points per scan include all surfaces; maps count observed endpoint cells. Target range RMS excludes misses, which remain in the detection denominator. Weather is attenuation only, without backscatter. Three seeds are descriptive.</w:t>
       </w:r>
     </w:p>
     <w:p>
@@ -2897,7 +3216,7 @@
                     <pic:cNvPicPr/>
                   </pic:nvPicPr>
                   <pic:blipFill>
-                    <a:blip r:embed="rId10"/>
+                    <a:blip r:embed="rId13"/>
                     <a:stretch>
                       <a:fillRect/>
                     </a:stretch>
@@ -2946,7 +3265,7 @@
                     <pic:cNvPicPr/>
                   </pic:nvPicPr>
                   <pic:blipFill>
-                    <a:blip r:embed="rId11"/>
+                    <a:blip r:embed="rId14"/>
                     <a:stretch>
                       <a:fillRect/>
                     </a:stretch>
@@ -2987,456 +3306,8 @@
         <w:pageBreakBefore/>
       </w:pPr>
       <w:r>
-        <w:t>4.2 Environmental measurement metrics</w:t>
+        <w:t>4.2 Sensor state and sensor configuration</w:t>
       </w:r>
-    </w:p>
-    <w:p>
-      <w:pPr>
-        <w:pStyle w:val="Caption"/>
-      </w:pPr>
-      <w:r>
-        <w:t>Table 1  Same fixed scene; three seeds per weather condition. Navigation/map values are means of run summaries. Range RMS and detection fraction pool target echoes at identical baseline poses.</w:t>
-      </w:r>
-    </w:p>
-    <w:tbl>
-      <w:tblPr>
-        <w:tblW w:type="auto" w:w="0"/>
-        <w:jc w:val="center"/>
-        <w:tblLayout w:type="fixed"/>
-        <w:tblLook w:firstColumn="1" w:firstRow="1" w:lastColumn="0" w:lastRow="0" w:noHBand="0" w:noVBand="1" w:val="04A0"/>
-        <w:tblBorders>
-          <w:top w:val="single" w:sz="4" w:color="D9D9D9"/>
-          <w:left w:val="single" w:sz="4" w:color="D9D9D9"/>
-          <w:bottom w:val="single" w:sz="4" w:color="D9D9D9"/>
-          <w:right w:val="single" w:sz="4" w:color="D9D9D9"/>
-          <w:insideH w:val="single" w:sz="4" w:color="D9D9D9"/>
-          <w:insideV w:val="single" w:sz="4" w:color="D9D9D9"/>
-        </w:tblBorders>
-        <w:tblCellMar>
-          <w:top w:w="65" w:type="dxa"/>
-          <w:left w:w="90" w:type="dxa"/>
-          <w:bottom w:w="65" w:type="dxa"/>
-          <w:right w:w="90" w:type="dxa"/>
-        </w:tblCellMar>
-      </w:tblPr>
-      <w:tblGrid>
-        <w:gridCol w:w="2160"/>
-        <w:gridCol w:w="1728"/>
-        <w:gridCol w:w="1728"/>
-        <w:gridCol w:w="1656"/>
-        <w:gridCol w:w="2088"/>
-      </w:tblGrid>
-      <w:tr>
-        <w:trPr>
-          <w:cantSplit/>
-          <w:tblHeader/>
-        </w:trPr>
-        <w:tc>
-          <w:tcPr>
-            <w:tcW w:type="dxa" w:w="2160"/>
-            <w:vAlign w:val="center"/>
-            <w:shd w:fill="EEEEEE"/>
-          </w:tcPr>
-          <w:p>
-            <w:pPr>
-              <w:spacing w:line="240" w:lineRule="auto" w:after="0"/>
-              <w:jc w:val="left"/>
-            </w:pPr>
-            <w:r>
-              <w:rPr>
-                <w:b/>
-                <w:sz w:val="22"/>
-              </w:rPr>
-              <w:t>Condition</w:t>
-            </w:r>
-          </w:p>
-        </w:tc>
-        <w:tc>
-          <w:tcPr>
-            <w:tcW w:type="dxa" w:w="1728"/>
-            <w:vAlign w:val="center"/>
-            <w:shd w:fill="EEEEEE"/>
-          </w:tcPr>
-          <w:p>
-            <w:pPr>
-              <w:spacing w:line="240" w:lineRule="auto" w:after="0"/>
-              <w:jc w:val="center"/>
-            </w:pPr>
-            <w:r>
-              <w:rPr>
-                <w:b/>
-                <w:sz w:val="22"/>
-              </w:rPr>
-              <w:t>Mean points / scan</w:t>
-            </w:r>
-          </w:p>
-        </w:tc>
-        <w:tc>
-          <w:tcPr>
-            <w:tcW w:type="dxa" w:w="1728"/>
-            <w:vAlign w:val="center"/>
-            <w:shd w:fill="EEEEEE"/>
-          </w:tcPr>
-          <w:p>
-            <w:pPr>
-              <w:spacing w:line="240" w:lineRule="auto" w:after="0"/>
-              <w:jc w:val="center"/>
-            </w:pPr>
-            <w:r>
-              <w:rPr>
-                <w:b/>
-                <w:sz w:val="22"/>
-              </w:rPr>
-              <w:t>Observed cells (%)</w:t>
-            </w:r>
-          </w:p>
-        </w:tc>
-        <w:tc>
-          <w:tcPr>
-            <w:tcW w:type="dxa" w:w="1656"/>
-            <w:vAlign w:val="center"/>
-            <w:shd w:fill="EEEEEE"/>
-          </w:tcPr>
-          <w:p>
-            <w:pPr>
-              <w:spacing w:line="240" w:lineRule="auto" w:after="0"/>
-              <w:jc w:val="center"/>
-            </w:pPr>
-            <w:r>
-              <w:rPr>
-                <w:b/>
-                <w:sz w:val="22"/>
-              </w:rPr>
-              <w:t>Target RMS (mm)</w:t>
-            </w:r>
-          </w:p>
-        </w:tc>
-        <w:tc>
-          <w:tcPr>
-            <w:tcW w:type="dxa" w:w="2088"/>
-            <w:vAlign w:val="center"/>
-            <w:shd w:fill="EEEEEE"/>
-          </w:tcPr>
-          <w:p>
-            <w:pPr>
-              <w:spacing w:line="240" w:lineRule="auto" w:after="0"/>
-              <w:jc w:val="center"/>
-            </w:pPr>
-            <w:r>
-              <w:rPr>
-                <w:b/>
-                <w:sz w:val="22"/>
-              </w:rPr>
-              <w:t>Detected / eligible (%)</w:t>
-            </w:r>
-          </w:p>
-        </w:tc>
-      </w:tr>
-      <w:tr>
-        <w:trPr>
-          <w:cantSplit/>
-        </w:trPr>
-        <w:tc>
-          <w:tcPr>
-            <w:tcW w:type="dxa" w:w="2160"/>
-            <w:vAlign w:val="center"/>
-          </w:tcPr>
-          <w:p>
-            <w:pPr>
-              <w:spacing w:line="240" w:lineRule="auto" w:after="0"/>
-              <w:jc w:val="left"/>
-            </w:pPr>
-            <w:r>
-              <w:rPr>
-                <w:b w:val="0"/>
-                <w:sz w:val="22"/>
-              </w:rPr>
-              <w:t>Clear</w:t>
-            </w:r>
-          </w:p>
-        </w:tc>
-        <w:tc>
-          <w:tcPr>
-            <w:tcW w:type="dxa" w:w="1728"/>
-            <w:vAlign w:val="center"/>
-          </w:tcPr>
-          <w:p>
-            <w:pPr>
-              <w:spacing w:line="240" w:lineRule="auto" w:after="0"/>
-              <w:jc w:val="center"/>
-            </w:pPr>
-            <w:r>
-              <w:rPr>
-                <w:b w:val="0"/>
-                <w:sz w:val="22"/>
-              </w:rPr>
-              <w:t>2,198.4</w:t>
-            </w:r>
-          </w:p>
-        </w:tc>
-        <w:tc>
-          <w:tcPr>
-            <w:tcW w:type="dxa" w:w="1728"/>
-            <w:vAlign w:val="center"/>
-          </w:tcPr>
-          <w:p>
-            <w:pPr>
-              <w:spacing w:line="240" w:lineRule="auto" w:after="0"/>
-              <w:jc w:val="center"/>
-            </w:pPr>
-            <w:r>
-              <w:rPr>
-                <w:b w:val="0"/>
-                <w:sz w:val="22"/>
-              </w:rPr>
-              <w:t>73.67</w:t>
-            </w:r>
-          </w:p>
-        </w:tc>
-        <w:tc>
-          <w:tcPr>
-            <w:tcW w:type="dxa" w:w="1656"/>
-            <w:vAlign w:val="center"/>
-          </w:tcPr>
-          <w:p>
-            <w:pPr>
-              <w:spacing w:line="240" w:lineRule="auto" w:after="0"/>
-              <w:jc w:val="center"/>
-            </w:pPr>
-            <w:r>
-              <w:rPr>
-                <w:b w:val="0"/>
-                <w:sz w:val="22"/>
-              </w:rPr>
-              <w:t>9.992</w:t>
-            </w:r>
-          </w:p>
-        </w:tc>
-        <w:tc>
-          <w:tcPr>
-            <w:tcW w:type="dxa" w:w="2088"/>
-            <w:vAlign w:val="center"/>
-          </w:tcPr>
-          <w:p>
-            <w:pPr>
-              <w:spacing w:line="240" w:lineRule="auto" w:after="0"/>
-              <w:jc w:val="center"/>
-            </w:pPr>
-            <w:r>
-              <w:rPr>
-                <w:b w:val="0"/>
-                <w:sz w:val="22"/>
-              </w:rPr>
-              <w:t>100.00</w:t>
-            </w:r>
-          </w:p>
-        </w:tc>
-      </w:tr>
-      <w:tr>
-        <w:trPr>
-          <w:cantSplit/>
-        </w:trPr>
-        <w:tc>
-          <w:tcPr>
-            <w:tcW w:type="dxa" w:w="2160"/>
-            <w:vAlign w:val="center"/>
-          </w:tcPr>
-          <w:p>
-            <w:pPr>
-              <w:spacing w:line="240" w:lineRule="auto" w:after="0"/>
-              <w:jc w:val="left"/>
-            </w:pPr>
-            <w:r>
-              <w:rPr>
-                <w:b w:val="0"/>
-                <w:sz w:val="22"/>
-              </w:rPr>
-              <w:t>Rain 50 mm/h</w:t>
-            </w:r>
-          </w:p>
-        </w:tc>
-        <w:tc>
-          <w:tcPr>
-            <w:tcW w:type="dxa" w:w="1728"/>
-            <w:vAlign w:val="center"/>
-          </w:tcPr>
-          <w:p>
-            <w:pPr>
-              <w:spacing w:line="240" w:lineRule="auto" w:after="0"/>
-              <w:jc w:val="center"/>
-            </w:pPr>
-            <w:r>
-              <w:rPr>
-                <w:b w:val="0"/>
-                <w:sz w:val="22"/>
-              </w:rPr>
-              <w:t>2,011.3</w:t>
-            </w:r>
-          </w:p>
-        </w:tc>
-        <w:tc>
-          <w:tcPr>
-            <w:tcW w:type="dxa" w:w="1728"/>
-            <w:vAlign w:val="center"/>
-          </w:tcPr>
-          <w:p>
-            <w:pPr>
-              <w:spacing w:line="240" w:lineRule="auto" w:after="0"/>
-              <w:jc w:val="center"/>
-            </w:pPr>
-            <w:r>
-              <w:rPr>
-                <w:b w:val="0"/>
-                <w:sz w:val="22"/>
-              </w:rPr>
-              <w:t>70.33</w:t>
-            </w:r>
-          </w:p>
-        </w:tc>
-        <w:tc>
-          <w:tcPr>
-            <w:tcW w:type="dxa" w:w="1656"/>
-            <w:vAlign w:val="center"/>
-          </w:tcPr>
-          <w:p>
-            <w:pPr>
-              <w:spacing w:line="240" w:lineRule="auto" w:after="0"/>
-              <w:jc w:val="center"/>
-            </w:pPr>
-            <w:r>
-              <w:rPr>
-                <w:b w:val="0"/>
-                <w:sz w:val="22"/>
-              </w:rPr>
-              <w:t>10.006</w:t>
-            </w:r>
-          </w:p>
-        </w:tc>
-        <w:tc>
-          <w:tcPr>
-            <w:tcW w:type="dxa" w:w="2088"/>
-            <w:vAlign w:val="center"/>
-          </w:tcPr>
-          <w:p>
-            <w:pPr>
-              <w:spacing w:line="240" w:lineRule="auto" w:after="0"/>
-              <w:jc w:val="center"/>
-            </w:pPr>
-            <w:r>
-              <w:rPr>
-                <w:b w:val="0"/>
-                <w:sz w:val="22"/>
-              </w:rPr>
-              <w:t>100.00</w:t>
-            </w:r>
-          </w:p>
-        </w:tc>
-      </w:tr>
-      <w:tr>
-        <w:trPr>
-          <w:cantSplit/>
-        </w:trPr>
-        <w:tc>
-          <w:tcPr>
-            <w:tcW w:type="dxa" w:w="2160"/>
-            <w:vAlign w:val="center"/>
-          </w:tcPr>
-          <w:p>
-            <w:pPr>
-              <w:spacing w:line="240" w:lineRule="auto" w:after="0"/>
-              <w:jc w:val="left"/>
-            </w:pPr>
-            <w:r>
-              <w:rPr>
-                <w:b w:val="0"/>
-                <w:sz w:val="22"/>
-              </w:rPr>
-              <w:t>Fog κ = 0.6 m⁻¹</w:t>
-            </w:r>
-          </w:p>
-        </w:tc>
-        <w:tc>
-          <w:tcPr>
-            <w:tcW w:type="dxa" w:w="1728"/>
-            <w:vAlign w:val="center"/>
-          </w:tcPr>
-          <w:p>
-            <w:pPr>
-              <w:spacing w:line="240" w:lineRule="auto" w:after="0"/>
-              <w:jc w:val="center"/>
-            </w:pPr>
-            <w:r>
-              <w:rPr>
-                <w:b w:val="0"/>
-                <w:sz w:val="22"/>
-              </w:rPr>
-              <w:t>1,742.0</w:t>
-            </w:r>
-          </w:p>
-        </w:tc>
-        <w:tc>
-          <w:tcPr>
-            <w:tcW w:type="dxa" w:w="1728"/>
-            <w:vAlign w:val="center"/>
-          </w:tcPr>
-          <w:p>
-            <w:pPr>
-              <w:spacing w:line="240" w:lineRule="auto" w:after="0"/>
-              <w:jc w:val="center"/>
-            </w:pPr>
-            <w:r>
-              <w:rPr>
-                <w:b w:val="0"/>
-                <w:sz w:val="22"/>
-              </w:rPr>
-              <w:t>47.10</w:t>
-            </w:r>
-          </w:p>
-        </w:tc>
-        <w:tc>
-          <w:tcPr>
-            <w:tcW w:type="dxa" w:w="1656"/>
-            <w:vAlign w:val="center"/>
-          </w:tcPr>
-          <w:p>
-            <w:pPr>
-              <w:spacing w:line="240" w:lineRule="auto" w:after="0"/>
-              <w:jc w:val="center"/>
-            </w:pPr>
-            <w:r>
-              <w:rPr>
-                <w:b w:val="0"/>
-                <w:sz w:val="22"/>
-              </w:rPr>
-              <w:t>11.139</w:t>
-            </w:r>
-          </w:p>
-        </w:tc>
-        <w:tc>
-          <w:tcPr>
-            <w:tcW w:type="dxa" w:w="2088"/>
-            <w:vAlign w:val="center"/>
-          </w:tcPr>
-          <w:p>
-            <w:pPr>
-              <w:spacing w:line="240" w:lineRule="auto" w:after="0"/>
-              <w:jc w:val="center"/>
-            </w:pPr>
-            <w:r>
-              <w:rPr>
-                <w:b w:val="0"/>
-                <w:sz w:val="22"/>
-              </w:rPr>
-              <w:t>98.07</w:t>
-            </w:r>
-          </w:p>
-        </w:tc>
-      </w:tr>
-    </w:tbl>
-    <w:p>
-      <w:pPr>
-        <w:spacing w:after="20" w:line="20" w:lineRule="exact"/>
-      </w:pPr>
     </w:p>
     <w:p>
       <w:pPr>
@@ -3447,8 +3318,8 @@
       <w:r>
         <w:drawing>
           <wp:inline xmlns:a="http://schemas.openxmlformats.org/drawingml/2006/main" xmlns:pic="http://schemas.openxmlformats.org/drawingml/2006/picture">
-            <wp:extent cx="5943600" cy="2377440"/>
-            <wp:docPr id="3" name="Picture 3" descr="Clear, rain and fog measurement profiles at the same baseline poses, including detected target returns, power and pooled cumulative range RMS."/>
+            <wp:extent cx="5108283" cy="2423160"/>
+            <wp:docPr id="3" name="Picture 3" descr="Controlled mounting-height evidence and four fixed-angle combinations of angular sample count and target diffuse reflectance, with power, range-conditioned detection and conditional range RMS."/>
             <wp:cNvGraphicFramePr>
               <a:graphicFrameLocks noChangeAspect="1"/>
             </wp:cNvGraphicFramePr>
@@ -3456,11 +3327,11 @@
               <a:graphicData uri="http://schemas.openxmlformats.org/drawingml/2006/picture">
                 <pic:pic>
                   <pic:nvPicPr>
-                    <pic:cNvPr id="0" name="weather_measurements.png"/>
+                    <pic:cNvPr id="0" name="sensor_dependencies.png"/>
                     <pic:cNvPicPr/>
                   </pic:nvPicPr>
                   <pic:blipFill>
-                    <a:blip r:embed="rId12"/>
+                    <a:blip r:embed="rId15"/>
                     <a:stretch>
                       <a:fillRect/>
                     </a:stretch>
@@ -3468,7 +3339,7 @@
                   <pic:spPr>
                     <a:xfrm>
                       <a:off x="0" y="0"/>
-                      <a:ext cx="5943600" cy="2377440"/>
+                      <a:ext cx="5108283" cy="2423160"/>
                     </a:xfrm>
                     <a:prstGeom prst="rect"/>
                   </pic:spPr>
@@ -3484,25 +3355,74 @@
         <w:pStyle w:val="Caption"/>
       </w:pPr>
       <w:r>
-        <w:t>Figure 3  Weather measurement profiles over the same saved baseline poses. Colors denote weather; all three seeds contribute. Cumulative range RMS uses pooled detected-return squared errors and its actual detection denominator. No profile is extended beyond its recorded exposure.</w:t>
+        <w:t>Figure 3  (a) Ground range versus mounting height at fixed angles. (b-d) Four sampling/reflectance combinations at matched poses. Dashed curves and black markers are predictions; dots and bars are simulations. Detection bins group poses by mean eligible range; RMS labels give detection counts.</w:t>
       </w:r>
     </w:p>
     <w:p>
       <w:r>
-        <w:t>Rain and fog reduce mean eligible target power from 0.745081 to 0.575356 and 0.187126 mW. This follows the two-way attenuation term in Equation (7); target geometry and angular sampling are unchanged.</w:t>
+        <w:t>Height 0.6-3 m gives ground ranges 2.318-11.591 m at fixed -15 degree elevation. Separately, an 80 degree FOV at yaw 0/40/45/50 degrees gives 132/70/6/0 target returns; full-circle integer-grid yaw retains 132. Both state components matter; factorial mounting angles stay fixed.</w:t>
       </w:r>
     </w:p>
     <w:p>
       <w:r>
-        <w:t>Fog lowers mean points per scan by 20.8 percent and observed endpoint coverage by 26.57 percentage points relative to clear air. Target RMS rises from 9.992 to 11.139 mm, while detection falls to 98.07 percent of eligible target echoes. These describe different denominators: whole-scene closed-loop returns, common-region endpoint cells, and detected-target replay errors.</w:t>
+        <w:t>Bright/weak power scales by 17,000. Fourfold beam sampling gives 46,712/11,592 bright-target detections; grids sample different features. Dense weak/bright detection is 74.52/100 percent and RMS 22.34/9.99 mm. Tenfold receiver noise changes scene returns 2,198.4→2,011.2 per scan and target RMS 9.992→10.082 mm; target detection stays saturated.</w:t>
       </w:r>
     </w:p>
     <w:p>
       <w:pPr>
-        <w:spacing w:after="0"/>
+        <w:pStyle w:val="Heading2"/>
       </w:pPr>
       <w:r>
-        <w:t>The range floor dominates strong nearby returns, so a substantial optical-power loss can produce a small RMS increase. Detection and coverage expose losses that conditional range RMS alone can conceal. Missing returns remain in the detection denominator; map gaps are not filled using scene truth.</w:t>
+        <w:t>4.3 Environmental measurement metrics</w:t>
+      </w:r>
+    </w:p>
+    <w:p>
+      <w:pPr>
+        <w:keepNext/>
+        <w:spacing w:after="40" w:line="240" w:lineRule="auto"/>
+        <w:jc w:val="center"/>
+      </w:pPr>
+      <w:r>
+        <w:drawing>
+          <wp:inline xmlns:a="http://schemas.openxmlformats.org/drawingml/2006/main" xmlns:pic="http://schemas.openxmlformats.org/drawingml/2006/picture">
+            <wp:extent cx="5943600" cy="1508760"/>
+            <wp:docPr id="4" name="Picture 4" descr="Clear, rain and fog measurement profiles at the same baseline poses, including detected target returns, power and pooled cumulative range RMS."/>
+            <wp:cNvGraphicFramePr>
+              <a:graphicFrameLocks noChangeAspect="1"/>
+            </wp:cNvGraphicFramePr>
+            <a:graphic>
+              <a:graphicData uri="http://schemas.openxmlformats.org/drawingml/2006/picture">
+                <pic:pic>
+                  <pic:nvPicPr>
+                    <pic:cNvPr id="0" name="weather_measurements_compact.png"/>
+                    <pic:cNvPicPr/>
+                  </pic:nvPicPr>
+                  <pic:blipFill>
+                    <a:blip r:embed="rId16"/>
+                    <a:stretch>
+                      <a:fillRect/>
+                    </a:stretch>
+                  </pic:blipFill>
+                  <pic:spPr>
+                    <a:xfrm>
+                      <a:off x="0" y="0"/>
+                      <a:ext cx="5943600" cy="1508760"/>
+                    </a:xfrm>
+                    <a:prstGeom prst="rect"/>
+                  </pic:spPr>
+                </pic:pic>
+              </a:graphicData>
+            </a:graphic>
+          </wp:inline>
+        </w:drawing>
+      </w:r>
+    </w:p>
+    <w:p>
+      <w:pPr>
+        <w:pStyle w:val="Caption"/>
+      </w:pPr>
+      <w:r>
+        <w:t>Figure 4  Normal, rain, and fog at matched baseline poses, all seeds. Cumulative target RMS uses actual detections. Attenuation reduces power; the range floor limits RMS changes for strong returns. Profiles stop at recorded exposure.</w:t>
       </w:r>
     </w:p>
     <w:p>
@@ -3511,7 +3431,7 @@
         <w:pageBreakBefore/>
       </w:pPr>
       <w:r>
-        <w:t>4.3 Near-threshold detection and range uncertainty</w:t>
+        <w:t>4.4 Near threshold detection and range uncertainty</w:t>
       </w:r>
     </w:p>
     <w:p>
@@ -3524,7 +3444,7 @@
         <w:drawing>
           <wp:inline xmlns:a="http://schemas.openxmlformats.org/drawingml/2006/main" xmlns:pic="http://schemas.openxmlformats.org/drawingml/2006/picture">
             <wp:extent cx="5943600" cy="2011680"/>
-            <wp:docPr id="4" name="Picture 4" descr="Three near-threshold target-ray detection curves and calibration residuals with pointwise Wilson intervals."/>
+            <wp:docPr id="5" name="Picture 5" descr="Three near-threshold target-ray detection curves and calibration residuals with pointwise Wilson intervals."/>
             <wp:cNvGraphicFramePr>
               <a:graphicFrameLocks noChangeAspect="1"/>
             </wp:cNvGraphicFramePr>
@@ -3536,7 +3456,7 @@
                     <pic:cNvPicPr/>
                   </pic:nvPicPr>
                   <pic:blipFill>
-                    <a:blip r:embed="rId13"/>
+                    <a:blip r:embed="rId17"/>
                     <a:stretch>
                       <a:fillRect/>
                     </a:stretch>
@@ -3560,7 +3480,7 @@
         <w:pStyle w:val="Caption"/>
       </w:pPr>
       <w:r>
-        <w:t>Figure 4  Detection and calibration residuals from 33,000 actual scan trials. Each marker counts 1,000 trials, including misses; bars are pointwise 95% Wilson intervals. Small horizontal offsets distinguish viewpoints. The shaded band is the predicted 5-95% transition, not an uncertainty interval.</w:t>
+        <w:t>Figure 5  Detection and calibration residuals from 33,000 actual scan trials. Each marker counts 1,000 trials, including misses; bars are pointwise 95% Wilson intervals. Small horizontal offsets distinguish viewpoints. The shaded band is the predicted 5-95% transition, not an uncertainty interval.</w:t>
       </w:r>
     </w:p>
     <w:p>
@@ -4041,7 +3961,7 @@
         <w:pageBreakBefore/>
       </w:pPr>
       <w:r>
-        <w:t>4.4 Environmental conditions through navigation</w:t>
+        <w:t>4.5 Environmental conditions through navigation</w:t>
       </w:r>
     </w:p>
     <w:p>
@@ -4053,8 +3973,8 @@
       <w:r>
         <w:drawing>
           <wp:inline xmlns:a="http://schemas.openxmlformats.org/drawingml/2006/main" xmlns:pic="http://schemas.openxmlformats.org/drawingml/2006/picture">
-            <wp:extent cx="5943600" cy="2743200"/>
-            <wp:docPr id="5" name="Picture 5" descr="All nine recorded weather trajectories in the unchanged three dimensional obstacle scene with a top-down detail."/>
+            <wp:extent cx="5547359" cy="2560320"/>
+            <wp:docPr id="6" name="Picture 6" descr="All nine recorded weather trajectories in the unchanged three dimensional obstacle scene with a top-down detail."/>
             <wp:cNvGraphicFramePr>
               <a:graphicFrameLocks noChangeAspect="1"/>
             </wp:cNvGraphicFramePr>
@@ -4066,7 +3986,7 @@
                     <pic:cNvPicPr/>
                   </pic:nvPicPr>
                   <pic:blipFill>
-                    <a:blip r:embed="rId14"/>
+                    <a:blip r:embed="rId18"/>
                     <a:stretch>
                       <a:fillRect/>
                     </a:stretch>
@@ -4074,7 +3994,7 @@
                   <pic:spPr>
                     <a:xfrm>
                       <a:off x="0" y="0"/>
-                      <a:ext cx="5943600" cy="2743200"/>
+                      <a:ext cx="5547359" cy="2560320"/>
                     </a:xfrm>
                     <a:prstGeom prst="rect"/>
                   </pic:spPr>
@@ -4094,8 +4014,8 @@
       <w:r>
         <w:drawing>
           <wp:inline xmlns:a="http://schemas.openxmlformats.org/drawingml/2006/main" xmlns:pic="http://schemas.openxmlformats.org/drawingml/2006/picture">
-            <wp:extent cx="5943600" cy="2286000"/>
-            <wp:docPr id="6" name="Picture 6" descr="Recorded weather histories of returns, endpoint coverage, swept clearance and spatial route error, retaining all seeds and true termination times."/>
+            <wp:extent cx="5586984" cy="2148840"/>
+            <wp:docPr id="7" name="Picture 7" descr="Recorded weather histories of returns, endpoint coverage, swept clearance and spatial route error, retaining all seeds and true termination times."/>
             <wp:cNvGraphicFramePr>
               <a:graphicFrameLocks noChangeAspect="1"/>
             </wp:cNvGraphicFramePr>
@@ -4107,7 +4027,7 @@
                     <pic:cNvPicPr/>
                   </pic:nvPicPr>
                   <pic:blipFill>
-                    <a:blip r:embed="rId15"/>
+                    <a:blip r:embed="rId19"/>
                     <a:stretch>
                       <a:fillRect/>
                     </a:stretch>
@@ -4115,7 +4035,7 @@
                   <pic:spPr>
                     <a:xfrm>
                       <a:off x="0" y="0"/>
-                      <a:ext cx="5943600" cy="2286000"/>
+                      <a:ext cx="5586984" cy="2148840"/>
                     </a:xfrm>
                     <a:prstGeom prst="rect"/>
                   </pic:spPr>
@@ -4131,7 +4051,7 @@
         <w:pStyle w:val="Caption"/>
       </w:pPr>
       <w:r>
-        <w:t>Figure 5  All nine weather runs in the unchanged scene. Upper: recorded 3D paths and top-down detail. Lower: points per scan, endpoint coverage, swept clearance, and route error. Exact overlaps remain overlaps. Lines stop at recorded termination; terminal poses add no scan. Colors denote weather, line styles seeds.</w:t>
+        <w:t>Figure 6  All nine weather runs in the unchanged scene. Upper: recorded 3D paths and top-down detail. Lower: points per scan, endpoint coverage, swept clearance, and route error. Exact overlaps remain overlaps. Lines stop at recorded termination; terminal poses add no scan. Colors denote weather, line styles seeds.</w:t>
       </w:r>
     </w:p>
     <w:p>
@@ -4139,7 +4059,7 @@
         <w:pStyle w:val="Caption"/>
       </w:pPr>
       <w:r>
-        <w:t>Table 2  Three runs per condition; all reach the goal without collision or timeout. Gap is the worst swept clearance. Three seeds are descriptive.</w:t>
+        <w:t>Table 1  Three-seed means, except pooled target RMS and worst swept gap. Map counts observed endpoint cells. All runs reach the goal without collision or timeout; three seeds are descriptive.</w:t>
       </w:r>
     </w:p>
     <w:tbl>
@@ -4164,11 +4084,14 @@
         </w:tblCellMar>
       </w:tblPr>
       <w:tblGrid>
-        <w:gridCol w:w="2448"/>
-        <w:gridCol w:w="864"/>
-        <w:gridCol w:w="1944"/>
-        <w:gridCol w:w="2016"/>
-        <w:gridCol w:w="2088"/>
+        <w:gridCol w:w="1728"/>
+        <w:gridCol w:w="1296"/>
+        <w:gridCol w:w="1008"/>
+        <w:gridCol w:w="1152"/>
+        <w:gridCol w:w="792"/>
+        <w:gridCol w:w="936"/>
+        <w:gridCol w:w="1152"/>
+        <w:gridCol w:w="1296"/>
       </w:tblGrid>
       <w:tr>
         <w:trPr>
@@ -4177,7 +4100,7 @@
         </w:trPr>
         <w:tc>
           <w:tcPr>
-            <w:tcW w:type="dxa" w:w="2448"/>
+            <w:tcW w:type="dxa" w:w="1728"/>
             <w:vAlign w:val="center"/>
             <w:shd w:fill="EEEEEE"/>
           </w:tcPr>
@@ -4197,7 +4120,67 @@
         </w:tc>
         <w:tc>
           <w:tcPr>
-            <w:tcW w:type="dxa" w:w="864"/>
+            <w:tcW w:type="dxa" w:w="1296"/>
+            <w:vAlign w:val="center"/>
+            <w:shd w:fill="EEEEEE"/>
+          </w:tcPr>
+          <w:p>
+            <w:pPr>
+              <w:spacing w:line="240" w:lineRule="auto" w:after="0"/>
+              <w:jc w:val="center"/>
+            </w:pPr>
+            <w:r>
+              <w:rPr>
+                <w:b/>
+                <w:sz w:val="22"/>
+              </w:rPr>
+              <w:t>Points / scan</w:t>
+            </w:r>
+          </w:p>
+        </w:tc>
+        <w:tc>
+          <w:tcPr>
+            <w:tcW w:type="dxa" w:w="1008"/>
+            <w:vAlign w:val="center"/>
+            <w:shd w:fill="EEEEEE"/>
+          </w:tcPr>
+          <w:p>
+            <w:pPr>
+              <w:spacing w:line="240" w:lineRule="auto" w:after="0"/>
+              <w:jc w:val="center"/>
+            </w:pPr>
+            <w:r>
+              <w:rPr>
+                <w:b/>
+                <w:sz w:val="22"/>
+              </w:rPr>
+              <w:t>Map (%)</w:t>
+            </w:r>
+          </w:p>
+        </w:tc>
+        <w:tc>
+          <w:tcPr>
+            <w:tcW w:type="dxa" w:w="1152"/>
+            <w:vAlign w:val="center"/>
+            <w:shd w:fill="EEEEEE"/>
+          </w:tcPr>
+          <w:p>
+            <w:pPr>
+              <w:spacing w:line="240" w:lineRule="auto" w:after="0"/>
+              <w:jc w:val="center"/>
+            </w:pPr>
+            <w:r>
+              <w:rPr>
+                <w:b/>
+                <w:sz w:val="22"/>
+              </w:rPr>
+              <w:t>RMS (mm)</w:t>
+            </w:r>
+          </w:p>
+        </w:tc>
+        <w:tc>
+          <w:tcPr>
+            <w:tcW w:type="dxa" w:w="792"/>
             <w:vAlign w:val="center"/>
             <w:shd w:fill="EEEEEE"/>
           </w:tcPr>
@@ -4217,7 +4200,7 @@
         </w:tc>
         <w:tc>
           <w:tcPr>
-            <w:tcW w:type="dxa" w:w="1944"/>
+            <w:tcW w:type="dxa" w:w="936"/>
             <w:vAlign w:val="center"/>
             <w:shd w:fill="EEEEEE"/>
           </w:tcPr>
@@ -4231,13 +4214,13 @@
                 <w:b/>
                 <w:sz w:val="22"/>
               </w:rPr>
-              <w:t>Mean time (s)</w:t>
+              <w:t>Time (s)</w:t>
             </w:r>
           </w:p>
         </w:tc>
         <w:tc>
           <w:tcPr>
-            <w:tcW w:type="dxa" w:w="2016"/>
+            <w:tcW w:type="dxa" w:w="1152"/>
             <w:vAlign w:val="center"/>
             <w:shd w:fill="EEEEEE"/>
           </w:tcPr>
@@ -4251,13 +4234,13 @@
                 <w:b/>
                 <w:sz w:val="22"/>
               </w:rPr>
-              <w:t>Mean path (m)</w:t>
+              <w:t>Path (m)</w:t>
             </w:r>
           </w:p>
         </w:tc>
         <w:tc>
           <w:tcPr>
-            <w:tcW w:type="dxa" w:w="2088"/>
+            <w:tcW w:type="dxa" w:w="1296"/>
             <w:vAlign w:val="center"/>
             <w:shd w:fill="EEEEEE"/>
           </w:tcPr>
@@ -4271,7 +4254,7 @@
                 <w:b/>
                 <w:sz w:val="22"/>
               </w:rPr>
-              <w:t>Min gap (m)</w:t>
+              <w:t>Gap (m)</w:t>
             </w:r>
           </w:p>
         </w:tc>
@@ -4282,7 +4265,7 @@
         </w:trPr>
         <w:tc>
           <w:tcPr>
-            <w:tcW w:type="dxa" w:w="2448"/>
+            <w:tcW w:type="dxa" w:w="1728"/>
             <w:vAlign w:val="center"/>
           </w:tcPr>
           <w:p>
@@ -4295,13 +4278,70 @@
                 <w:b w:val="0"/>
                 <w:sz w:val="22"/>
               </w:rPr>
-              <w:t>Clear</w:t>
+              <w:t>Normal</w:t>
             </w:r>
           </w:p>
         </w:tc>
         <w:tc>
           <w:tcPr>
-            <w:tcW w:type="dxa" w:w="864"/>
+            <w:tcW w:type="dxa" w:w="1296"/>
+            <w:vAlign w:val="center"/>
+          </w:tcPr>
+          <w:p>
+            <w:pPr>
+              <w:spacing w:line="240" w:lineRule="auto" w:after="0"/>
+              <w:jc w:val="center"/>
+            </w:pPr>
+            <w:r>
+              <w:rPr>
+                <w:b w:val="0"/>
+                <w:sz w:val="22"/>
+              </w:rPr>
+              <w:t>2,198.4</w:t>
+            </w:r>
+          </w:p>
+        </w:tc>
+        <w:tc>
+          <w:tcPr>
+            <w:tcW w:type="dxa" w:w="1008"/>
+            <w:vAlign w:val="center"/>
+          </w:tcPr>
+          <w:p>
+            <w:pPr>
+              <w:spacing w:line="240" w:lineRule="auto" w:after="0"/>
+              <w:jc w:val="center"/>
+            </w:pPr>
+            <w:r>
+              <w:rPr>
+                <w:b w:val="0"/>
+                <w:sz w:val="22"/>
+              </w:rPr>
+              <w:t>73.67</w:t>
+            </w:r>
+          </w:p>
+        </w:tc>
+        <w:tc>
+          <w:tcPr>
+            <w:tcW w:type="dxa" w:w="1152"/>
+            <w:vAlign w:val="center"/>
+          </w:tcPr>
+          <w:p>
+            <w:pPr>
+              <w:spacing w:line="240" w:lineRule="auto" w:after="0"/>
+              <w:jc w:val="center"/>
+            </w:pPr>
+            <w:r>
+              <w:rPr>
+                <w:b w:val="0"/>
+                <w:sz w:val="22"/>
+              </w:rPr>
+              <w:t>9.992</w:t>
+            </w:r>
+          </w:p>
+        </w:tc>
+        <w:tc>
+          <w:tcPr>
+            <w:tcW w:type="dxa" w:w="792"/>
             <w:vAlign w:val="center"/>
           </w:tcPr>
           <w:p>
@@ -4320,7 +4360,7 @@
         </w:tc>
         <w:tc>
           <w:tcPr>
-            <w:tcW w:type="dxa" w:w="1944"/>
+            <w:tcW w:type="dxa" w:w="936"/>
             <w:vAlign w:val="center"/>
           </w:tcPr>
           <w:p>
@@ -4339,7 +4379,7 @@
         </w:tc>
         <w:tc>
           <w:tcPr>
-            <w:tcW w:type="dxa" w:w="2016"/>
+            <w:tcW w:type="dxa" w:w="1152"/>
             <w:vAlign w:val="center"/>
           </w:tcPr>
           <w:p>
@@ -4358,7 +4398,7 @@
         </w:tc>
         <w:tc>
           <w:tcPr>
-            <w:tcW w:type="dxa" w:w="2088"/>
+            <w:tcW w:type="dxa" w:w="1296"/>
             <w:vAlign w:val="center"/>
           </w:tcPr>
           <w:p>
@@ -4382,7 +4422,7 @@
         </w:trPr>
         <w:tc>
           <w:tcPr>
-            <w:tcW w:type="dxa" w:w="2448"/>
+            <w:tcW w:type="dxa" w:w="1728"/>
             <w:vAlign w:val="center"/>
           </w:tcPr>
           <w:p>
@@ -4401,7 +4441,64 @@
         </w:tc>
         <w:tc>
           <w:tcPr>
-            <w:tcW w:type="dxa" w:w="864"/>
+            <w:tcW w:type="dxa" w:w="1296"/>
+            <w:vAlign w:val="center"/>
+          </w:tcPr>
+          <w:p>
+            <w:pPr>
+              <w:spacing w:line="240" w:lineRule="auto" w:after="0"/>
+              <w:jc w:val="center"/>
+            </w:pPr>
+            <w:r>
+              <w:rPr>
+                <w:b w:val="0"/>
+                <w:sz w:val="22"/>
+              </w:rPr>
+              <w:t>2,011.3</w:t>
+            </w:r>
+          </w:p>
+        </w:tc>
+        <w:tc>
+          <w:tcPr>
+            <w:tcW w:type="dxa" w:w="1008"/>
+            <w:vAlign w:val="center"/>
+          </w:tcPr>
+          <w:p>
+            <w:pPr>
+              <w:spacing w:line="240" w:lineRule="auto" w:after="0"/>
+              <w:jc w:val="center"/>
+            </w:pPr>
+            <w:r>
+              <w:rPr>
+                <w:b w:val="0"/>
+                <w:sz w:val="22"/>
+              </w:rPr>
+              <w:t>70.33</w:t>
+            </w:r>
+          </w:p>
+        </w:tc>
+        <w:tc>
+          <w:tcPr>
+            <w:tcW w:type="dxa" w:w="1152"/>
+            <w:vAlign w:val="center"/>
+          </w:tcPr>
+          <w:p>
+            <w:pPr>
+              <w:spacing w:line="240" w:lineRule="auto" w:after="0"/>
+              <w:jc w:val="center"/>
+            </w:pPr>
+            <w:r>
+              <w:rPr>
+                <w:b w:val="0"/>
+                <w:sz w:val="22"/>
+              </w:rPr>
+              <w:t>10.006</w:t>
+            </w:r>
+          </w:p>
+        </w:tc>
+        <w:tc>
+          <w:tcPr>
+            <w:tcW w:type="dxa" w:w="792"/>
             <w:vAlign w:val="center"/>
           </w:tcPr>
           <w:p>
@@ -4420,7 +4517,7 @@
         </w:tc>
         <w:tc>
           <w:tcPr>
-            <w:tcW w:type="dxa" w:w="1944"/>
+            <w:tcW w:type="dxa" w:w="936"/>
             <w:vAlign w:val="center"/>
           </w:tcPr>
           <w:p>
@@ -4439,7 +4536,7 @@
         </w:tc>
         <w:tc>
           <w:tcPr>
-            <w:tcW w:type="dxa" w:w="2016"/>
+            <w:tcW w:type="dxa" w:w="1152"/>
             <w:vAlign w:val="center"/>
           </w:tcPr>
           <w:p>
@@ -4458,7 +4555,7 @@
         </w:tc>
         <w:tc>
           <w:tcPr>
-            <w:tcW w:type="dxa" w:w="2088"/>
+            <w:tcW w:type="dxa" w:w="1296"/>
             <w:vAlign w:val="center"/>
           </w:tcPr>
           <w:p>
@@ -4482,7 +4579,7 @@
         </w:trPr>
         <w:tc>
           <w:tcPr>
-            <w:tcW w:type="dxa" w:w="2448"/>
+            <w:tcW w:type="dxa" w:w="1728"/>
             <w:vAlign w:val="center"/>
           </w:tcPr>
           <w:p>
@@ -4501,7 +4598,64 @@
         </w:tc>
         <w:tc>
           <w:tcPr>
-            <w:tcW w:type="dxa" w:w="864"/>
+            <w:tcW w:type="dxa" w:w="1296"/>
+            <w:vAlign w:val="center"/>
+          </w:tcPr>
+          <w:p>
+            <w:pPr>
+              <w:spacing w:line="240" w:lineRule="auto" w:after="0"/>
+              <w:jc w:val="center"/>
+            </w:pPr>
+            <w:r>
+              <w:rPr>
+                <w:b w:val="0"/>
+                <w:sz w:val="22"/>
+              </w:rPr>
+              <w:t>1,742.0</w:t>
+            </w:r>
+          </w:p>
+        </w:tc>
+        <w:tc>
+          <w:tcPr>
+            <w:tcW w:type="dxa" w:w="1008"/>
+            <w:vAlign w:val="center"/>
+          </w:tcPr>
+          <w:p>
+            <w:pPr>
+              <w:spacing w:line="240" w:lineRule="auto" w:after="0"/>
+              <w:jc w:val="center"/>
+            </w:pPr>
+            <w:r>
+              <w:rPr>
+                <w:b w:val="0"/>
+                <w:sz w:val="22"/>
+              </w:rPr>
+              <w:t>47.10</w:t>
+            </w:r>
+          </w:p>
+        </w:tc>
+        <w:tc>
+          <w:tcPr>
+            <w:tcW w:type="dxa" w:w="1152"/>
+            <w:vAlign w:val="center"/>
+          </w:tcPr>
+          <w:p>
+            <w:pPr>
+              <w:spacing w:line="240" w:lineRule="auto" w:after="0"/>
+              <w:jc w:val="center"/>
+            </w:pPr>
+            <w:r>
+              <w:rPr>
+                <w:b w:val="0"/>
+                <w:sz w:val="22"/>
+              </w:rPr>
+              <w:t>11.139</w:t>
+            </w:r>
+          </w:p>
+        </w:tc>
+        <w:tc>
+          <w:tcPr>
+            <w:tcW w:type="dxa" w:w="792"/>
             <w:vAlign w:val="center"/>
           </w:tcPr>
           <w:p>
@@ -4520,7 +4674,7 @@
         </w:tc>
         <w:tc>
           <w:tcPr>
-            <w:tcW w:type="dxa" w:w="1944"/>
+            <w:tcW w:type="dxa" w:w="936"/>
             <w:vAlign w:val="center"/>
           </w:tcPr>
           <w:p>
@@ -4539,7 +4693,7 @@
         </w:tc>
         <w:tc>
           <w:tcPr>
-            <w:tcW w:type="dxa" w:w="2016"/>
+            <w:tcW w:type="dxa" w:w="1152"/>
             <w:vAlign w:val="center"/>
           </w:tcPr>
           <w:p>
@@ -4558,7 +4712,7 @@
         </w:tc>
         <w:tc>
           <w:tcPr>
-            <w:tcW w:type="dxa" w:w="2088"/>
+            <w:tcW w:type="dxa" w:w="1296"/>
             <w:vAlign w:val="center"/>
           </w:tcPr>
           <w:p>
@@ -4588,7 +4742,7 @@
         <w:pageBreakBefore/>
       </w:pPr>
       <w:r>
-        <w:t>4.5 Route generation and measured 3D mapping</w:t>
+        <w:t>4.6 Measured mapping and media evidence</w:t>
       </w:r>
     </w:p>
     <w:p>
@@ -4600,8 +4754,8 @@
       <w:r>
         <w:drawing>
           <wp:inline xmlns:a="http://schemas.openxmlformats.org/drawingml/2006/main" xmlns:pic="http://schemas.openxmlformats.org/drawingml/2006/picture">
-            <wp:extent cx="5943600" cy="2011680"/>
-            <wp:docPr id="7" name="Picture 7" descr="Measured three dimensional endpoint maps in clear air, rain and fog, sharing physical axes and height colors."/>
+            <wp:extent cx="5133109" cy="1737360"/>
+            <wp:docPr id="8" name="Picture 8" descr="Measured three dimensional endpoint maps in clear air, rain and fog, sharing physical axes and height colors."/>
             <wp:cNvGraphicFramePr>
               <a:graphicFrameLocks noChangeAspect="1"/>
             </wp:cNvGraphicFramePr>
@@ -4613,7 +4767,7 @@
                     <pic:cNvPicPr/>
                   </pic:nvPicPr>
                   <pic:blipFill>
-                    <a:blip r:embed="rId16"/>
+                    <a:blip r:embed="rId20"/>
                     <a:stretch>
                       <a:fillRect/>
                     </a:stretch>
@@ -4621,7 +4775,7 @@
                   <pic:spPr>
                     <a:xfrm>
                       <a:off x="0" y="0"/>
-                      <a:ext cx="5943600" cy="2011680"/>
+                      <a:ext cx="5133109" cy="1737360"/>
                     </a:xfrm>
                     <a:prstGeom prst="rect"/>
                   </pic:spPr>
@@ -4637,12 +4791,17 @@
         <w:pStyle w:val="Caption"/>
       </w:pPr>
       <w:r>
-        <w:t>Figure 6  Seed-1 measured maps for clear air, rain, and fog in the same fixed scene. Colors show height; all panels use the same axes and height scale. Display hides z ≤ 0.12 m. Each map ends with its own run; no true scene surfaces fill gaps.</w:t>
+        <w:t>Figure 7  Seed-1 normal, rain, and fog maps; shared axes and height colors. Display hides z ≤ 0.12 m. Scene truth never fills gaps.</w:t>
       </w:r>
     </w:p>
     <w:p>
       <w:r>
-        <w:t>Measured surfaces accumulate in 0.12 m voxels. Endpoint cells are 0.2 m over [-2, 21] m × [-6, 7] m (NROI = 7,475). For K intervals and K + 1 states,</w:t>
+        <w:t>Normal, rain, and fog detect 100, 100, and 98.07 percent of eligible target echoes. Fog reduces scene returns by 20.8 percent and endpoint coverage by 26.57 percentage points. All weather runs still reach the goal; map observations do not establish accuracy or free space.</w:t>
+      </w:r>
+    </w:p>
+    <w:p>
+      <w:r>
+        <w:t>Maps use 0.12 m voxels and 0.2 m endpoint cells over [-2, 21] m × [-6, 7] m (NROI = 7,475). For K intervals,</w:t>
       </w:r>
     </w:p>
     <w:p>
@@ -4792,12 +4951,7 @@
     </w:p>
     <w:p>
       <w:r>
-        <w:t>Mean observed endpoint cells are 73.67 percent in clear air, 70.33 in rain, and 47.10 in fog. All weather runs reach the goal; endpoint observations do not establish accuracy or free space.</w:t>
-      </w:r>
-    </w:p>
-    <w:p>
-      <w:r>
-        <w:t>Independent checks cover 65 geometry and 72 power cases; maximum residuals are 3.83e-13 m and 4.39e-16 relative power.</w:t>
+        <w:t>The companion videos show weather, dense/bright versus sparse/weak settings, and all four sampling/reflectance combinations. Figure 3 isolates measurement causes. The favorable/adverse pair does not establish global optima or guaranteed navigation outcomes.</w:t>
       </w:r>
     </w:p>
     <w:p>
@@ -4810,7 +4964,7 @@
     </w:p>
     <w:p>
       <w:r>
-        <w:t>Target replays expose surface response and geometric sampling. With obstacles fixed, attenuation reduces returns and coverage and increases conditional range error, although all nine weather runs succeed. Threshold trials support the assumed noise model. Three seeds do not establish navigation reliability. Physical calibration, backscatter, pose uncertainty, moving objects, and scan motion remain future work.</w:t>
+        <w:t>Residuals are at most 3.83e-13 m in 65 geometry checks and 4.39e-16 in 72 power checks. Controlled dependencies and threshold calibration support internal consistency, not physical accuracy or navigation reliability. Backscatter, pose uncertainty, moving targets, and closed-loop scan motion remain untested. Mapping uses exact poses, not SLAM.</w:t>
       </w:r>
     </w:p>
     <w:p>

</xml_diff>